<commit_message>
docs: Fix UML Use-Case diagram layout, margins, and text alignment with zero overlaps
</commit_message>
<xml_diff>
--- a/docs/Team11_Project_Report.docx
+++ b/docs/Team11_Project_Report.docx
@@ -97,15 +97,15 @@
         <w:tblLook w:firstColumn="1" w:firstRow="1" w:lastColumn="0" w:lastRow="0" w:noHBand="0" w:noVBand="1" w:val="04A0"/>
       </w:tblPr>
       <w:tblGrid>
-        <w:gridCol w:w="2340"/>
-        <w:gridCol w:w="2340"/>
-        <w:gridCol w:w="2340"/>
-        <w:gridCol w:w="2340"/>
+        <w:gridCol w:w="2412"/>
+        <w:gridCol w:w="2412"/>
+        <w:gridCol w:w="2412"/>
+        <w:gridCol w:w="2412"/>
       </w:tblGrid>
       <w:tr>
         <w:tc>
           <w:tcPr>
-            <w:tcW w:type="dxa" w:w="2340"/>
+            <w:tcW w:type="dxa" w:w="2412"/>
             <w:shd w:fill="E5E7EB"/>
           </w:tcPr>
           <w:p>
@@ -125,7 +125,7 @@
         </w:tc>
         <w:tc>
           <w:tcPr>
-            <w:tcW w:type="dxa" w:w="2340"/>
+            <w:tcW w:type="dxa" w:w="2412"/>
             <w:shd w:fill="E5E7EB"/>
           </w:tcPr>
           <w:p>
@@ -145,7 +145,7 @@
         </w:tc>
         <w:tc>
           <w:tcPr>
-            <w:tcW w:type="dxa" w:w="2340"/>
+            <w:tcW w:type="dxa" w:w="2412"/>
             <w:shd w:fill="E5E7EB"/>
           </w:tcPr>
           <w:p>
@@ -165,7 +165,7 @@
         </w:tc>
         <w:tc>
           <w:tcPr>
-            <w:tcW w:type="dxa" w:w="2340"/>
+            <w:tcW w:type="dxa" w:w="2412"/>
             <w:shd w:fill="E5E7EB"/>
           </w:tcPr>
           <w:p>
@@ -187,7 +187,7 @@
       <w:tr>
         <w:tc>
           <w:tcPr>
-            <w:tcW w:type="dxa" w:w="2340"/>
+            <w:tcW w:type="dxa" w:w="2412"/>
             <w:shd w:fill="F9FAFB"/>
           </w:tcPr>
           <w:p>
@@ -203,7 +203,7 @@
         </w:tc>
         <w:tc>
           <w:tcPr>
-            <w:tcW w:type="dxa" w:w="2340"/>
+            <w:tcW w:type="dxa" w:w="2412"/>
             <w:shd w:fill="F9FAFB"/>
           </w:tcPr>
           <w:p>
@@ -219,7 +219,7 @@
         </w:tc>
         <w:tc>
           <w:tcPr>
-            <w:tcW w:type="dxa" w:w="2340"/>
+            <w:tcW w:type="dxa" w:w="2412"/>
             <w:shd w:fill="F9FAFB"/>
           </w:tcPr>
           <w:p>
@@ -235,7 +235,7 @@
         </w:tc>
         <w:tc>
           <w:tcPr>
-            <w:tcW w:type="dxa" w:w="2340"/>
+            <w:tcW w:type="dxa" w:w="2412"/>
             <w:shd w:fill="F9FAFB"/>
           </w:tcPr>
           <w:p>
@@ -253,7 +253,7 @@
       <w:tr>
         <w:tc>
           <w:tcPr>
-            <w:tcW w:type="dxa" w:w="2340"/>
+            <w:tcW w:type="dxa" w:w="2412"/>
             <w:shd w:fill="FFFFFF"/>
           </w:tcPr>
           <w:p>
@@ -269,7 +269,7 @@
         </w:tc>
         <w:tc>
           <w:tcPr>
-            <w:tcW w:type="dxa" w:w="2340"/>
+            <w:tcW w:type="dxa" w:w="2412"/>
             <w:shd w:fill="FFFFFF"/>
           </w:tcPr>
           <w:p>
@@ -285,7 +285,7 @@
         </w:tc>
         <w:tc>
           <w:tcPr>
-            <w:tcW w:type="dxa" w:w="2340"/>
+            <w:tcW w:type="dxa" w:w="2412"/>
             <w:shd w:fill="FFFFFF"/>
           </w:tcPr>
           <w:p>
@@ -301,7 +301,7 @@
         </w:tc>
         <w:tc>
           <w:tcPr>
-            <w:tcW w:type="dxa" w:w="2340"/>
+            <w:tcW w:type="dxa" w:w="2412"/>
             <w:shd w:fill="FFFFFF"/>
           </w:tcPr>
           <w:p>
@@ -319,7 +319,7 @@
       <w:tr>
         <w:tc>
           <w:tcPr>
-            <w:tcW w:type="dxa" w:w="2340"/>
+            <w:tcW w:type="dxa" w:w="2412"/>
             <w:shd w:fill="F9FAFB"/>
           </w:tcPr>
           <w:p>
@@ -335,7 +335,7 @@
         </w:tc>
         <w:tc>
           <w:tcPr>
-            <w:tcW w:type="dxa" w:w="2340"/>
+            <w:tcW w:type="dxa" w:w="2412"/>
             <w:shd w:fill="F9FAFB"/>
           </w:tcPr>
           <w:p>
@@ -351,7 +351,7 @@
         </w:tc>
         <w:tc>
           <w:tcPr>
-            <w:tcW w:type="dxa" w:w="2340"/>
+            <w:tcW w:type="dxa" w:w="2412"/>
             <w:shd w:fill="F9FAFB"/>
           </w:tcPr>
           <w:p>
@@ -367,7 +367,7 @@
         </w:tc>
         <w:tc>
           <w:tcPr>
-            <w:tcW w:type="dxa" w:w="2340"/>
+            <w:tcW w:type="dxa" w:w="2412"/>
             <w:shd w:fill="F9FAFB"/>
           </w:tcPr>
           <w:p>
@@ -385,7 +385,7 @@
       <w:tr>
         <w:tc>
           <w:tcPr>
-            <w:tcW w:type="dxa" w:w="2340"/>
+            <w:tcW w:type="dxa" w:w="2412"/>
             <w:shd w:fill="FFFFFF"/>
           </w:tcPr>
           <w:p>
@@ -401,7 +401,7 @@
         </w:tc>
         <w:tc>
           <w:tcPr>
-            <w:tcW w:type="dxa" w:w="2340"/>
+            <w:tcW w:type="dxa" w:w="2412"/>
             <w:shd w:fill="FFFFFF"/>
           </w:tcPr>
           <w:p>
@@ -417,7 +417,7 @@
         </w:tc>
         <w:tc>
           <w:tcPr>
-            <w:tcW w:type="dxa" w:w="2340"/>
+            <w:tcW w:type="dxa" w:w="2412"/>
             <w:shd w:fill="FFFFFF"/>
           </w:tcPr>
           <w:p>
@@ -433,7 +433,7 @@
         </w:tc>
         <w:tc>
           <w:tcPr>
-            <w:tcW w:type="dxa" w:w="2340"/>
+            <w:tcW w:type="dxa" w:w="2412"/>
             <w:shd w:fill="FFFFFF"/>
           </w:tcPr>
           <w:p>
@@ -503,16 +503,16 @@
         <w:tblLook w:firstColumn="1" w:firstRow="1" w:lastColumn="0" w:lastRow="0" w:noHBand="0" w:noVBand="1" w:val="04A0"/>
       </w:tblPr>
       <w:tblGrid>
-        <w:gridCol w:w="1872"/>
-        <w:gridCol w:w="1872"/>
-        <w:gridCol w:w="1872"/>
-        <w:gridCol w:w="1872"/>
-        <w:gridCol w:w="1872"/>
+        <w:gridCol w:w="1930"/>
+        <w:gridCol w:w="1930"/>
+        <w:gridCol w:w="1930"/>
+        <w:gridCol w:w="1930"/>
+        <w:gridCol w:w="1930"/>
       </w:tblGrid>
       <w:tr>
         <w:tc>
           <w:tcPr>
-            <w:tcW w:type="dxa" w:w="1872"/>
+            <w:tcW w:type="dxa" w:w="1930"/>
             <w:shd w:fill="E5E7EB"/>
           </w:tcPr>
           <w:p>
@@ -532,7 +532,7 @@
         </w:tc>
         <w:tc>
           <w:tcPr>
-            <w:tcW w:type="dxa" w:w="1872"/>
+            <w:tcW w:type="dxa" w:w="1930"/>
             <w:shd w:fill="E5E7EB"/>
           </w:tcPr>
           <w:p>
@@ -552,7 +552,7 @@
         </w:tc>
         <w:tc>
           <w:tcPr>
-            <w:tcW w:type="dxa" w:w="1872"/>
+            <w:tcW w:type="dxa" w:w="1930"/>
             <w:shd w:fill="E5E7EB"/>
           </w:tcPr>
           <w:p>
@@ -572,7 +572,7 @@
         </w:tc>
         <w:tc>
           <w:tcPr>
-            <w:tcW w:type="dxa" w:w="1872"/>
+            <w:tcW w:type="dxa" w:w="1930"/>
             <w:shd w:fill="E5E7EB"/>
           </w:tcPr>
           <w:p>
@@ -592,7 +592,7 @@
         </w:tc>
         <w:tc>
           <w:tcPr>
-            <w:tcW w:type="dxa" w:w="1872"/>
+            <w:tcW w:type="dxa" w:w="1930"/>
             <w:shd w:fill="E5E7EB"/>
           </w:tcPr>
           <w:p>
@@ -614,7 +614,7 @@
       <w:tr>
         <w:tc>
           <w:tcPr>
-            <w:tcW w:type="dxa" w:w="1872"/>
+            <w:tcW w:type="dxa" w:w="1930"/>
             <w:shd w:fill="F9FAFB"/>
           </w:tcPr>
           <w:p>
@@ -630,7 +630,7 @@
         </w:tc>
         <w:tc>
           <w:tcPr>
-            <w:tcW w:type="dxa" w:w="1872"/>
+            <w:tcW w:type="dxa" w:w="1930"/>
             <w:shd w:fill="F9FAFB"/>
           </w:tcPr>
           <w:p>
@@ -646,7 +646,7 @@
         </w:tc>
         <w:tc>
           <w:tcPr>
-            <w:tcW w:type="dxa" w:w="1872"/>
+            <w:tcW w:type="dxa" w:w="1930"/>
             <w:shd w:fill="F9FAFB"/>
           </w:tcPr>
           <w:p>
@@ -662,7 +662,7 @@
         </w:tc>
         <w:tc>
           <w:tcPr>
-            <w:tcW w:type="dxa" w:w="1872"/>
+            <w:tcW w:type="dxa" w:w="1930"/>
             <w:shd w:fill="F9FAFB"/>
           </w:tcPr>
           <w:p>
@@ -678,7 +678,7 @@
         </w:tc>
         <w:tc>
           <w:tcPr>
-            <w:tcW w:type="dxa" w:w="1872"/>
+            <w:tcW w:type="dxa" w:w="1930"/>
             <w:shd w:fill="F9FAFB"/>
           </w:tcPr>
           <w:p>
@@ -703,15 +703,15 @@
         <w:tblLook w:firstColumn="1" w:firstRow="1" w:lastColumn="0" w:lastRow="0" w:noHBand="0" w:noVBand="1" w:val="04A0"/>
       </w:tblPr>
       <w:tblGrid>
-        <w:gridCol w:w="2340"/>
-        <w:gridCol w:w="2340"/>
-        <w:gridCol w:w="2340"/>
-        <w:gridCol w:w="2340"/>
+        <w:gridCol w:w="2412"/>
+        <w:gridCol w:w="2412"/>
+        <w:gridCol w:w="2412"/>
+        <w:gridCol w:w="2412"/>
       </w:tblGrid>
       <w:tr>
         <w:tc>
           <w:tcPr>
-            <w:tcW w:type="dxa" w:w="2340"/>
+            <w:tcW w:type="dxa" w:w="2412"/>
             <w:shd w:fill="E5E7EB"/>
           </w:tcPr>
           <w:p>
@@ -731,7 +731,7 @@
         </w:tc>
         <w:tc>
           <w:tcPr>
-            <w:tcW w:type="dxa" w:w="2340"/>
+            <w:tcW w:type="dxa" w:w="2412"/>
             <w:shd w:fill="E5E7EB"/>
           </w:tcPr>
           <w:p>
@@ -751,7 +751,7 @@
         </w:tc>
         <w:tc>
           <w:tcPr>
-            <w:tcW w:type="dxa" w:w="2340"/>
+            <w:tcW w:type="dxa" w:w="2412"/>
             <w:shd w:fill="E5E7EB"/>
           </w:tcPr>
           <w:p>
@@ -771,7 +771,7 @@
         </w:tc>
         <w:tc>
           <w:tcPr>
-            <w:tcW w:type="dxa" w:w="2340"/>
+            <w:tcW w:type="dxa" w:w="2412"/>
             <w:shd w:fill="E5E7EB"/>
           </w:tcPr>
           <w:p>
@@ -793,7 +793,7 @@
       <w:tr>
         <w:tc>
           <w:tcPr>
-            <w:tcW w:type="dxa" w:w="2340"/>
+            <w:tcW w:type="dxa" w:w="2412"/>
             <w:shd w:fill="F9FAFB"/>
           </w:tcPr>
           <w:p>
@@ -809,7 +809,7 @@
         </w:tc>
         <w:tc>
           <w:tcPr>
-            <w:tcW w:type="dxa" w:w="2340"/>
+            <w:tcW w:type="dxa" w:w="2412"/>
             <w:shd w:fill="F9FAFB"/>
           </w:tcPr>
           <w:p>
@@ -825,7 +825,7 @@
         </w:tc>
         <w:tc>
           <w:tcPr>
-            <w:tcW w:type="dxa" w:w="2340"/>
+            <w:tcW w:type="dxa" w:w="2412"/>
             <w:shd w:fill="F9FAFB"/>
           </w:tcPr>
           <w:p>
@@ -841,7 +841,7 @@
         </w:tc>
         <w:tc>
           <w:tcPr>
-            <w:tcW w:type="dxa" w:w="2340"/>
+            <w:tcW w:type="dxa" w:w="2412"/>
             <w:shd w:fill="F9FAFB"/>
           </w:tcPr>
           <w:p>
@@ -859,7 +859,7 @@
       <w:tr>
         <w:tc>
           <w:tcPr>
-            <w:tcW w:type="dxa" w:w="2340"/>
+            <w:tcW w:type="dxa" w:w="2412"/>
             <w:shd w:fill="FFFFFF"/>
           </w:tcPr>
           <w:p>
@@ -875,7 +875,7 @@
         </w:tc>
         <w:tc>
           <w:tcPr>
-            <w:tcW w:type="dxa" w:w="2340"/>
+            <w:tcW w:type="dxa" w:w="2412"/>
             <w:shd w:fill="FFFFFF"/>
           </w:tcPr>
           <w:p>
@@ -891,7 +891,7 @@
         </w:tc>
         <w:tc>
           <w:tcPr>
-            <w:tcW w:type="dxa" w:w="2340"/>
+            <w:tcW w:type="dxa" w:w="2412"/>
             <w:shd w:fill="FFFFFF"/>
           </w:tcPr>
           <w:p>
@@ -907,7 +907,7 @@
         </w:tc>
         <w:tc>
           <w:tcPr>
-            <w:tcW w:type="dxa" w:w="2340"/>
+            <w:tcW w:type="dxa" w:w="2412"/>
             <w:shd w:fill="FFFFFF"/>
           </w:tcPr>
           <w:p>
@@ -1368,18 +1368,18 @@
         <w:tblLook w:firstColumn="1" w:firstRow="1" w:lastColumn="0" w:lastRow="0" w:noHBand="0" w:noVBand="1" w:val="04A0"/>
       </w:tblPr>
       <w:tblGrid>
-        <w:gridCol w:w="1337"/>
-        <w:gridCol w:w="1337"/>
-        <w:gridCol w:w="1337"/>
-        <w:gridCol w:w="1337"/>
-        <w:gridCol w:w="1337"/>
-        <w:gridCol w:w="1337"/>
-        <w:gridCol w:w="1337"/>
+        <w:gridCol w:w="1378"/>
+        <w:gridCol w:w="1378"/>
+        <w:gridCol w:w="1378"/>
+        <w:gridCol w:w="1378"/>
+        <w:gridCol w:w="1378"/>
+        <w:gridCol w:w="1378"/>
+        <w:gridCol w:w="1378"/>
       </w:tblGrid>
       <w:tr>
         <w:tc>
           <w:tcPr>
-            <w:tcW w:type="dxa" w:w="1337"/>
+            <w:tcW w:type="dxa" w:w="1378"/>
             <w:shd w:fill="E5E7EB"/>
           </w:tcPr>
           <w:p>
@@ -1399,7 +1399,7 @@
         </w:tc>
         <w:tc>
           <w:tcPr>
-            <w:tcW w:type="dxa" w:w="1337"/>
+            <w:tcW w:type="dxa" w:w="1378"/>
             <w:shd w:fill="E5E7EB"/>
           </w:tcPr>
           <w:p>
@@ -1419,7 +1419,7 @@
         </w:tc>
         <w:tc>
           <w:tcPr>
-            <w:tcW w:type="dxa" w:w="1337"/>
+            <w:tcW w:type="dxa" w:w="1378"/>
             <w:shd w:fill="E5E7EB"/>
           </w:tcPr>
           <w:p>
@@ -1439,7 +1439,7 @@
         </w:tc>
         <w:tc>
           <w:tcPr>
-            <w:tcW w:type="dxa" w:w="1337"/>
+            <w:tcW w:type="dxa" w:w="1378"/>
             <w:shd w:fill="E5E7EB"/>
           </w:tcPr>
           <w:p>
@@ -1459,7 +1459,7 @@
         </w:tc>
         <w:tc>
           <w:tcPr>
-            <w:tcW w:type="dxa" w:w="1337"/>
+            <w:tcW w:type="dxa" w:w="1378"/>
             <w:shd w:fill="E5E7EB"/>
           </w:tcPr>
           <w:p>
@@ -1479,7 +1479,7 @@
         </w:tc>
         <w:tc>
           <w:tcPr>
-            <w:tcW w:type="dxa" w:w="1337"/>
+            <w:tcW w:type="dxa" w:w="1378"/>
             <w:shd w:fill="E5E7EB"/>
           </w:tcPr>
           <w:p>
@@ -1499,7 +1499,7 @@
         </w:tc>
         <w:tc>
           <w:tcPr>
-            <w:tcW w:type="dxa" w:w="1337"/>
+            <w:tcW w:type="dxa" w:w="1378"/>
             <w:shd w:fill="E5E7EB"/>
           </w:tcPr>
           <w:p>
@@ -1521,7 +1521,7 @@
       <w:tr>
         <w:tc>
           <w:tcPr>
-            <w:tcW w:type="dxa" w:w="1337"/>
+            <w:tcW w:type="dxa" w:w="1378"/>
             <w:shd w:fill="F9FAFB"/>
           </w:tcPr>
           <w:p>
@@ -1537,7 +1537,7 @@
         </w:tc>
         <w:tc>
           <w:tcPr>
-            <w:tcW w:type="dxa" w:w="1337"/>
+            <w:tcW w:type="dxa" w:w="1378"/>
             <w:shd w:fill="F9FAFB"/>
           </w:tcPr>
           <w:p>
@@ -1553,7 +1553,7 @@
         </w:tc>
         <w:tc>
           <w:tcPr>
-            <w:tcW w:type="dxa" w:w="1337"/>
+            <w:tcW w:type="dxa" w:w="1378"/>
             <w:shd w:fill="F9FAFB"/>
           </w:tcPr>
           <w:p>
@@ -1569,7 +1569,7 @@
         </w:tc>
         <w:tc>
           <w:tcPr>
-            <w:tcW w:type="dxa" w:w="1337"/>
+            <w:tcW w:type="dxa" w:w="1378"/>
             <w:shd w:fill="F9FAFB"/>
           </w:tcPr>
           <w:p>
@@ -1585,7 +1585,7 @@
         </w:tc>
         <w:tc>
           <w:tcPr>
-            <w:tcW w:type="dxa" w:w="1337"/>
+            <w:tcW w:type="dxa" w:w="1378"/>
             <w:shd w:fill="F9FAFB"/>
           </w:tcPr>
           <w:p>
@@ -1601,7 +1601,7 @@
         </w:tc>
         <w:tc>
           <w:tcPr>
-            <w:tcW w:type="dxa" w:w="1337"/>
+            <w:tcW w:type="dxa" w:w="1378"/>
             <w:shd w:fill="F9FAFB"/>
           </w:tcPr>
           <w:p>
@@ -1617,7 +1617,7 @@
         </w:tc>
         <w:tc>
           <w:tcPr>
-            <w:tcW w:type="dxa" w:w="1337"/>
+            <w:tcW w:type="dxa" w:w="1378"/>
             <w:shd w:fill="F9FAFB"/>
           </w:tcPr>
           <w:p>
@@ -1635,7 +1635,7 @@
       <w:tr>
         <w:tc>
           <w:tcPr>
-            <w:tcW w:type="dxa" w:w="1337"/>
+            <w:tcW w:type="dxa" w:w="1378"/>
             <w:shd w:fill="FFFFFF"/>
           </w:tcPr>
           <w:p>
@@ -1651,7 +1651,7 @@
         </w:tc>
         <w:tc>
           <w:tcPr>
-            <w:tcW w:type="dxa" w:w="1337"/>
+            <w:tcW w:type="dxa" w:w="1378"/>
             <w:shd w:fill="FFFFFF"/>
           </w:tcPr>
           <w:p>
@@ -1667,7 +1667,7 @@
         </w:tc>
         <w:tc>
           <w:tcPr>
-            <w:tcW w:type="dxa" w:w="1337"/>
+            <w:tcW w:type="dxa" w:w="1378"/>
             <w:shd w:fill="FFFFFF"/>
           </w:tcPr>
           <w:p>
@@ -1683,7 +1683,7 @@
         </w:tc>
         <w:tc>
           <w:tcPr>
-            <w:tcW w:type="dxa" w:w="1337"/>
+            <w:tcW w:type="dxa" w:w="1378"/>
             <w:shd w:fill="FFFFFF"/>
           </w:tcPr>
           <w:p>
@@ -1699,7 +1699,7 @@
         </w:tc>
         <w:tc>
           <w:tcPr>
-            <w:tcW w:type="dxa" w:w="1337"/>
+            <w:tcW w:type="dxa" w:w="1378"/>
             <w:shd w:fill="FFFFFF"/>
           </w:tcPr>
           <w:p>
@@ -1715,7 +1715,7 @@
         </w:tc>
         <w:tc>
           <w:tcPr>
-            <w:tcW w:type="dxa" w:w="1337"/>
+            <w:tcW w:type="dxa" w:w="1378"/>
             <w:shd w:fill="FFFFFF"/>
           </w:tcPr>
           <w:p>
@@ -1731,7 +1731,7 @@
         </w:tc>
         <w:tc>
           <w:tcPr>
-            <w:tcW w:type="dxa" w:w="1337"/>
+            <w:tcW w:type="dxa" w:w="1378"/>
             <w:shd w:fill="FFFFFF"/>
           </w:tcPr>
           <w:p>
@@ -1749,7 +1749,7 @@
       <w:tr>
         <w:tc>
           <w:tcPr>
-            <w:tcW w:type="dxa" w:w="1337"/>
+            <w:tcW w:type="dxa" w:w="1378"/>
             <w:shd w:fill="F9FAFB"/>
           </w:tcPr>
           <w:p>
@@ -1765,7 +1765,7 @@
         </w:tc>
         <w:tc>
           <w:tcPr>
-            <w:tcW w:type="dxa" w:w="1337"/>
+            <w:tcW w:type="dxa" w:w="1378"/>
             <w:shd w:fill="F9FAFB"/>
           </w:tcPr>
           <w:p>
@@ -1781,7 +1781,7 @@
         </w:tc>
         <w:tc>
           <w:tcPr>
-            <w:tcW w:type="dxa" w:w="1337"/>
+            <w:tcW w:type="dxa" w:w="1378"/>
             <w:shd w:fill="F9FAFB"/>
           </w:tcPr>
           <w:p>
@@ -1797,7 +1797,7 @@
         </w:tc>
         <w:tc>
           <w:tcPr>
-            <w:tcW w:type="dxa" w:w="1337"/>
+            <w:tcW w:type="dxa" w:w="1378"/>
             <w:shd w:fill="F9FAFB"/>
           </w:tcPr>
           <w:p>
@@ -1813,7 +1813,7 @@
         </w:tc>
         <w:tc>
           <w:tcPr>
-            <w:tcW w:type="dxa" w:w="1337"/>
+            <w:tcW w:type="dxa" w:w="1378"/>
             <w:shd w:fill="F9FAFB"/>
           </w:tcPr>
           <w:p>
@@ -1829,7 +1829,7 @@
         </w:tc>
         <w:tc>
           <w:tcPr>
-            <w:tcW w:type="dxa" w:w="1337"/>
+            <w:tcW w:type="dxa" w:w="1378"/>
             <w:shd w:fill="F9FAFB"/>
           </w:tcPr>
           <w:p>
@@ -1845,7 +1845,7 @@
         </w:tc>
         <w:tc>
           <w:tcPr>
-            <w:tcW w:type="dxa" w:w="1337"/>
+            <w:tcW w:type="dxa" w:w="1378"/>
             <w:shd w:fill="F9FAFB"/>
           </w:tcPr>
           <w:p>
@@ -1863,7 +1863,7 @@
       <w:tr>
         <w:tc>
           <w:tcPr>
-            <w:tcW w:type="dxa" w:w="1337"/>
+            <w:tcW w:type="dxa" w:w="1378"/>
             <w:shd w:fill="FFFFFF"/>
           </w:tcPr>
           <w:p>
@@ -1879,7 +1879,7 @@
         </w:tc>
         <w:tc>
           <w:tcPr>
-            <w:tcW w:type="dxa" w:w="1337"/>
+            <w:tcW w:type="dxa" w:w="1378"/>
             <w:shd w:fill="FFFFFF"/>
           </w:tcPr>
           <w:p>
@@ -1895,7 +1895,7 @@
         </w:tc>
         <w:tc>
           <w:tcPr>
-            <w:tcW w:type="dxa" w:w="1337"/>
+            <w:tcW w:type="dxa" w:w="1378"/>
             <w:shd w:fill="FFFFFF"/>
           </w:tcPr>
           <w:p>
@@ -1911,7 +1911,7 @@
         </w:tc>
         <w:tc>
           <w:tcPr>
-            <w:tcW w:type="dxa" w:w="1337"/>
+            <w:tcW w:type="dxa" w:w="1378"/>
             <w:shd w:fill="FFFFFF"/>
           </w:tcPr>
           <w:p>
@@ -1927,7 +1927,7 @@
         </w:tc>
         <w:tc>
           <w:tcPr>
-            <w:tcW w:type="dxa" w:w="1337"/>
+            <w:tcW w:type="dxa" w:w="1378"/>
             <w:shd w:fill="FFFFFF"/>
           </w:tcPr>
           <w:p>
@@ -1943,7 +1943,7 @@
         </w:tc>
         <w:tc>
           <w:tcPr>
-            <w:tcW w:type="dxa" w:w="1337"/>
+            <w:tcW w:type="dxa" w:w="1378"/>
             <w:shd w:fill="FFFFFF"/>
           </w:tcPr>
           <w:p>
@@ -1959,7 +1959,7 @@
         </w:tc>
         <w:tc>
           <w:tcPr>
-            <w:tcW w:type="dxa" w:w="1337"/>
+            <w:tcW w:type="dxa" w:w="1378"/>
             <w:shd w:fill="FFFFFF"/>
           </w:tcPr>
           <w:p>
@@ -1977,7 +1977,7 @@
       <w:tr>
         <w:tc>
           <w:tcPr>
-            <w:tcW w:type="dxa" w:w="1337"/>
+            <w:tcW w:type="dxa" w:w="1378"/>
             <w:shd w:fill="F9FAFB"/>
           </w:tcPr>
           <w:p>
@@ -1993,7 +1993,7 @@
         </w:tc>
         <w:tc>
           <w:tcPr>
-            <w:tcW w:type="dxa" w:w="1337"/>
+            <w:tcW w:type="dxa" w:w="1378"/>
             <w:shd w:fill="F9FAFB"/>
           </w:tcPr>
           <w:p>
@@ -2009,7 +2009,7 @@
         </w:tc>
         <w:tc>
           <w:tcPr>
-            <w:tcW w:type="dxa" w:w="1337"/>
+            <w:tcW w:type="dxa" w:w="1378"/>
             <w:shd w:fill="F9FAFB"/>
           </w:tcPr>
           <w:p>
@@ -2025,7 +2025,7 @@
         </w:tc>
         <w:tc>
           <w:tcPr>
-            <w:tcW w:type="dxa" w:w="1337"/>
+            <w:tcW w:type="dxa" w:w="1378"/>
             <w:shd w:fill="F9FAFB"/>
           </w:tcPr>
           <w:p>
@@ -2041,7 +2041,7 @@
         </w:tc>
         <w:tc>
           <w:tcPr>
-            <w:tcW w:type="dxa" w:w="1337"/>
+            <w:tcW w:type="dxa" w:w="1378"/>
             <w:shd w:fill="F9FAFB"/>
           </w:tcPr>
           <w:p>
@@ -2057,7 +2057,7 @@
         </w:tc>
         <w:tc>
           <w:tcPr>
-            <w:tcW w:type="dxa" w:w="1337"/>
+            <w:tcW w:type="dxa" w:w="1378"/>
             <w:shd w:fill="F9FAFB"/>
           </w:tcPr>
           <w:p>
@@ -2073,7 +2073,7 @@
         </w:tc>
         <w:tc>
           <w:tcPr>
-            <w:tcW w:type="dxa" w:w="1337"/>
+            <w:tcW w:type="dxa" w:w="1378"/>
             <w:shd w:fill="F9FAFB"/>
           </w:tcPr>
           <w:p>
@@ -2091,7 +2091,7 @@
       <w:tr>
         <w:tc>
           <w:tcPr>
-            <w:tcW w:type="dxa" w:w="1337"/>
+            <w:tcW w:type="dxa" w:w="1378"/>
             <w:shd w:fill="FFFFFF"/>
           </w:tcPr>
           <w:p>
@@ -2107,7 +2107,7 @@
         </w:tc>
         <w:tc>
           <w:tcPr>
-            <w:tcW w:type="dxa" w:w="1337"/>
+            <w:tcW w:type="dxa" w:w="1378"/>
             <w:shd w:fill="FFFFFF"/>
           </w:tcPr>
           <w:p>
@@ -2123,7 +2123,7 @@
         </w:tc>
         <w:tc>
           <w:tcPr>
-            <w:tcW w:type="dxa" w:w="1337"/>
+            <w:tcW w:type="dxa" w:w="1378"/>
             <w:shd w:fill="FFFFFF"/>
           </w:tcPr>
           <w:p>
@@ -2139,7 +2139,7 @@
         </w:tc>
         <w:tc>
           <w:tcPr>
-            <w:tcW w:type="dxa" w:w="1337"/>
+            <w:tcW w:type="dxa" w:w="1378"/>
             <w:shd w:fill="FFFFFF"/>
           </w:tcPr>
           <w:p>
@@ -2155,7 +2155,7 @@
         </w:tc>
         <w:tc>
           <w:tcPr>
-            <w:tcW w:type="dxa" w:w="1337"/>
+            <w:tcW w:type="dxa" w:w="1378"/>
             <w:shd w:fill="FFFFFF"/>
           </w:tcPr>
           <w:p>
@@ -2171,7 +2171,7 @@
         </w:tc>
         <w:tc>
           <w:tcPr>
-            <w:tcW w:type="dxa" w:w="1337"/>
+            <w:tcW w:type="dxa" w:w="1378"/>
             <w:shd w:fill="FFFFFF"/>
           </w:tcPr>
           <w:p>
@@ -2187,7 +2187,7 @@
         </w:tc>
         <w:tc>
           <w:tcPr>
-            <w:tcW w:type="dxa" w:w="1337"/>
+            <w:tcW w:type="dxa" w:w="1378"/>
             <w:shd w:fill="FFFFFF"/>
           </w:tcPr>
           <w:p>
@@ -2205,7 +2205,7 @@
       <w:tr>
         <w:tc>
           <w:tcPr>
-            <w:tcW w:type="dxa" w:w="1337"/>
+            <w:tcW w:type="dxa" w:w="1378"/>
             <w:shd w:fill="F9FAFB"/>
           </w:tcPr>
           <w:p>
@@ -2221,7 +2221,7 @@
         </w:tc>
         <w:tc>
           <w:tcPr>
-            <w:tcW w:type="dxa" w:w="1337"/>
+            <w:tcW w:type="dxa" w:w="1378"/>
             <w:shd w:fill="F9FAFB"/>
           </w:tcPr>
           <w:p>
@@ -2237,7 +2237,7 @@
         </w:tc>
         <w:tc>
           <w:tcPr>
-            <w:tcW w:type="dxa" w:w="1337"/>
+            <w:tcW w:type="dxa" w:w="1378"/>
             <w:shd w:fill="F9FAFB"/>
           </w:tcPr>
           <w:p>
@@ -2253,7 +2253,7 @@
         </w:tc>
         <w:tc>
           <w:tcPr>
-            <w:tcW w:type="dxa" w:w="1337"/>
+            <w:tcW w:type="dxa" w:w="1378"/>
             <w:shd w:fill="F9FAFB"/>
           </w:tcPr>
           <w:p>
@@ -2269,7 +2269,7 @@
         </w:tc>
         <w:tc>
           <w:tcPr>
-            <w:tcW w:type="dxa" w:w="1337"/>
+            <w:tcW w:type="dxa" w:w="1378"/>
             <w:shd w:fill="F9FAFB"/>
           </w:tcPr>
           <w:p>
@@ -2285,7 +2285,7 @@
         </w:tc>
         <w:tc>
           <w:tcPr>
-            <w:tcW w:type="dxa" w:w="1337"/>
+            <w:tcW w:type="dxa" w:w="1378"/>
             <w:shd w:fill="F9FAFB"/>
           </w:tcPr>
           <w:p>
@@ -2301,7 +2301,7 @@
         </w:tc>
         <w:tc>
           <w:tcPr>
-            <w:tcW w:type="dxa" w:w="1337"/>
+            <w:tcW w:type="dxa" w:w="1378"/>
             <w:shd w:fill="F9FAFB"/>
           </w:tcPr>
           <w:p>
@@ -2319,7 +2319,7 @@
       <w:tr>
         <w:tc>
           <w:tcPr>
-            <w:tcW w:type="dxa" w:w="1337"/>
+            <w:tcW w:type="dxa" w:w="1378"/>
             <w:shd w:fill="FFFFFF"/>
           </w:tcPr>
           <w:p>
@@ -2335,7 +2335,7 @@
         </w:tc>
         <w:tc>
           <w:tcPr>
-            <w:tcW w:type="dxa" w:w="1337"/>
+            <w:tcW w:type="dxa" w:w="1378"/>
             <w:shd w:fill="FFFFFF"/>
           </w:tcPr>
           <w:p>
@@ -2351,7 +2351,7 @@
         </w:tc>
         <w:tc>
           <w:tcPr>
-            <w:tcW w:type="dxa" w:w="1337"/>
+            <w:tcW w:type="dxa" w:w="1378"/>
             <w:shd w:fill="FFFFFF"/>
           </w:tcPr>
           <w:p>
@@ -2367,7 +2367,7 @@
         </w:tc>
         <w:tc>
           <w:tcPr>
-            <w:tcW w:type="dxa" w:w="1337"/>
+            <w:tcW w:type="dxa" w:w="1378"/>
             <w:shd w:fill="FFFFFF"/>
           </w:tcPr>
           <w:p>
@@ -2383,7 +2383,7 @@
         </w:tc>
         <w:tc>
           <w:tcPr>
-            <w:tcW w:type="dxa" w:w="1337"/>
+            <w:tcW w:type="dxa" w:w="1378"/>
             <w:shd w:fill="FFFFFF"/>
           </w:tcPr>
           <w:p>
@@ -2399,7 +2399,7 @@
         </w:tc>
         <w:tc>
           <w:tcPr>
-            <w:tcW w:type="dxa" w:w="1337"/>
+            <w:tcW w:type="dxa" w:w="1378"/>
             <w:shd w:fill="FFFFFF"/>
           </w:tcPr>
           <w:p>
@@ -2415,7 +2415,7 @@
         </w:tc>
         <w:tc>
           <w:tcPr>
-            <w:tcW w:type="dxa" w:w="1337"/>
+            <w:tcW w:type="dxa" w:w="1378"/>
             <w:shd w:fill="FFFFFF"/>
           </w:tcPr>
           <w:p>
@@ -2433,7 +2433,7 @@
       <w:tr>
         <w:tc>
           <w:tcPr>
-            <w:tcW w:type="dxa" w:w="1337"/>
+            <w:tcW w:type="dxa" w:w="1378"/>
             <w:shd w:fill="F9FAFB"/>
           </w:tcPr>
           <w:p>
@@ -2449,7 +2449,7 @@
         </w:tc>
         <w:tc>
           <w:tcPr>
-            <w:tcW w:type="dxa" w:w="1337"/>
+            <w:tcW w:type="dxa" w:w="1378"/>
             <w:shd w:fill="F9FAFB"/>
           </w:tcPr>
           <w:p>
@@ -2465,7 +2465,7 @@
         </w:tc>
         <w:tc>
           <w:tcPr>
-            <w:tcW w:type="dxa" w:w="1337"/>
+            <w:tcW w:type="dxa" w:w="1378"/>
             <w:shd w:fill="F9FAFB"/>
           </w:tcPr>
           <w:p>
@@ -2481,7 +2481,7 @@
         </w:tc>
         <w:tc>
           <w:tcPr>
-            <w:tcW w:type="dxa" w:w="1337"/>
+            <w:tcW w:type="dxa" w:w="1378"/>
             <w:shd w:fill="F9FAFB"/>
           </w:tcPr>
           <w:p>
@@ -2497,7 +2497,7 @@
         </w:tc>
         <w:tc>
           <w:tcPr>
-            <w:tcW w:type="dxa" w:w="1337"/>
+            <w:tcW w:type="dxa" w:w="1378"/>
             <w:shd w:fill="F9FAFB"/>
           </w:tcPr>
           <w:p>
@@ -2513,7 +2513,7 @@
         </w:tc>
         <w:tc>
           <w:tcPr>
-            <w:tcW w:type="dxa" w:w="1337"/>
+            <w:tcW w:type="dxa" w:w="1378"/>
             <w:shd w:fill="F9FAFB"/>
           </w:tcPr>
           <w:p>
@@ -2529,7 +2529,7 @@
         </w:tc>
         <w:tc>
           <w:tcPr>
-            <w:tcW w:type="dxa" w:w="1337"/>
+            <w:tcW w:type="dxa" w:w="1378"/>
             <w:shd w:fill="F9FAFB"/>
           </w:tcPr>
           <w:p>
@@ -2547,7 +2547,7 @@
       <w:tr>
         <w:tc>
           <w:tcPr>
-            <w:tcW w:type="dxa" w:w="1337"/>
+            <w:tcW w:type="dxa" w:w="1378"/>
             <w:shd w:fill="FFFFFF"/>
           </w:tcPr>
           <w:p>
@@ -2563,7 +2563,7 @@
         </w:tc>
         <w:tc>
           <w:tcPr>
-            <w:tcW w:type="dxa" w:w="1337"/>
+            <w:tcW w:type="dxa" w:w="1378"/>
             <w:shd w:fill="FFFFFF"/>
           </w:tcPr>
           <w:p>
@@ -2579,7 +2579,7 @@
         </w:tc>
         <w:tc>
           <w:tcPr>
-            <w:tcW w:type="dxa" w:w="1337"/>
+            <w:tcW w:type="dxa" w:w="1378"/>
             <w:shd w:fill="FFFFFF"/>
           </w:tcPr>
           <w:p>
@@ -2595,7 +2595,7 @@
         </w:tc>
         <w:tc>
           <w:tcPr>
-            <w:tcW w:type="dxa" w:w="1337"/>
+            <w:tcW w:type="dxa" w:w="1378"/>
             <w:shd w:fill="FFFFFF"/>
           </w:tcPr>
           <w:p>
@@ -2611,7 +2611,7 @@
         </w:tc>
         <w:tc>
           <w:tcPr>
-            <w:tcW w:type="dxa" w:w="1337"/>
+            <w:tcW w:type="dxa" w:w="1378"/>
             <w:shd w:fill="FFFFFF"/>
           </w:tcPr>
           <w:p>
@@ -2627,7 +2627,7 @@
         </w:tc>
         <w:tc>
           <w:tcPr>
-            <w:tcW w:type="dxa" w:w="1337"/>
+            <w:tcW w:type="dxa" w:w="1378"/>
             <w:shd w:fill="FFFFFF"/>
           </w:tcPr>
           <w:p>
@@ -2643,7 +2643,7 @@
         </w:tc>
         <w:tc>
           <w:tcPr>
-            <w:tcW w:type="dxa" w:w="1337"/>
+            <w:tcW w:type="dxa" w:w="1378"/>
             <w:shd w:fill="FFFFFF"/>
           </w:tcPr>
           <w:p>
@@ -2661,7 +2661,7 @@
       <w:tr>
         <w:tc>
           <w:tcPr>
-            <w:tcW w:type="dxa" w:w="1337"/>
+            <w:tcW w:type="dxa" w:w="1378"/>
             <w:shd w:fill="F9FAFB"/>
           </w:tcPr>
           <w:p>
@@ -2677,7 +2677,7 @@
         </w:tc>
         <w:tc>
           <w:tcPr>
-            <w:tcW w:type="dxa" w:w="1337"/>
+            <w:tcW w:type="dxa" w:w="1378"/>
             <w:shd w:fill="F9FAFB"/>
           </w:tcPr>
           <w:p>
@@ -2693,7 +2693,7 @@
         </w:tc>
         <w:tc>
           <w:tcPr>
-            <w:tcW w:type="dxa" w:w="1337"/>
+            <w:tcW w:type="dxa" w:w="1378"/>
             <w:shd w:fill="F9FAFB"/>
           </w:tcPr>
           <w:p>
@@ -2709,7 +2709,7 @@
         </w:tc>
         <w:tc>
           <w:tcPr>
-            <w:tcW w:type="dxa" w:w="1337"/>
+            <w:tcW w:type="dxa" w:w="1378"/>
             <w:shd w:fill="F9FAFB"/>
           </w:tcPr>
           <w:p>
@@ -2725,7 +2725,7 @@
         </w:tc>
         <w:tc>
           <w:tcPr>
-            <w:tcW w:type="dxa" w:w="1337"/>
+            <w:tcW w:type="dxa" w:w="1378"/>
             <w:shd w:fill="F9FAFB"/>
           </w:tcPr>
           <w:p>
@@ -2741,7 +2741,7 @@
         </w:tc>
         <w:tc>
           <w:tcPr>
-            <w:tcW w:type="dxa" w:w="1337"/>
+            <w:tcW w:type="dxa" w:w="1378"/>
             <w:shd w:fill="F9FAFB"/>
           </w:tcPr>
           <w:p>
@@ -2757,7 +2757,7 @@
         </w:tc>
         <w:tc>
           <w:tcPr>
-            <w:tcW w:type="dxa" w:w="1337"/>
+            <w:tcW w:type="dxa" w:w="1378"/>
             <w:shd w:fill="F9FAFB"/>
           </w:tcPr>
           <w:p>
@@ -2775,7 +2775,7 @@
       <w:tr>
         <w:tc>
           <w:tcPr>
-            <w:tcW w:type="dxa" w:w="1337"/>
+            <w:tcW w:type="dxa" w:w="1378"/>
             <w:shd w:fill="FFFFFF"/>
           </w:tcPr>
           <w:p>
@@ -2791,7 +2791,7 @@
         </w:tc>
         <w:tc>
           <w:tcPr>
-            <w:tcW w:type="dxa" w:w="1337"/>
+            <w:tcW w:type="dxa" w:w="1378"/>
             <w:shd w:fill="FFFFFF"/>
           </w:tcPr>
           <w:p>
@@ -2807,7 +2807,7 @@
         </w:tc>
         <w:tc>
           <w:tcPr>
-            <w:tcW w:type="dxa" w:w="1337"/>
+            <w:tcW w:type="dxa" w:w="1378"/>
             <w:shd w:fill="FFFFFF"/>
           </w:tcPr>
           <w:p>
@@ -2823,7 +2823,7 @@
         </w:tc>
         <w:tc>
           <w:tcPr>
-            <w:tcW w:type="dxa" w:w="1337"/>
+            <w:tcW w:type="dxa" w:w="1378"/>
             <w:shd w:fill="FFFFFF"/>
           </w:tcPr>
           <w:p>
@@ -2839,7 +2839,7 @@
         </w:tc>
         <w:tc>
           <w:tcPr>
-            <w:tcW w:type="dxa" w:w="1337"/>
+            <w:tcW w:type="dxa" w:w="1378"/>
             <w:shd w:fill="FFFFFF"/>
           </w:tcPr>
           <w:p>
@@ -2855,7 +2855,7 @@
         </w:tc>
         <w:tc>
           <w:tcPr>
-            <w:tcW w:type="dxa" w:w="1337"/>
+            <w:tcW w:type="dxa" w:w="1378"/>
             <w:shd w:fill="FFFFFF"/>
           </w:tcPr>
           <w:p>
@@ -2871,7 +2871,7 @@
         </w:tc>
         <w:tc>
           <w:tcPr>
-            <w:tcW w:type="dxa" w:w="1337"/>
+            <w:tcW w:type="dxa" w:w="1378"/>
             <w:shd w:fill="FFFFFF"/>
           </w:tcPr>
           <w:p>
@@ -2889,7 +2889,7 @@
       <w:tr>
         <w:tc>
           <w:tcPr>
-            <w:tcW w:type="dxa" w:w="1337"/>
+            <w:tcW w:type="dxa" w:w="1378"/>
             <w:shd w:fill="F9FAFB"/>
           </w:tcPr>
           <w:p>
@@ -2905,7 +2905,7 @@
         </w:tc>
         <w:tc>
           <w:tcPr>
-            <w:tcW w:type="dxa" w:w="1337"/>
+            <w:tcW w:type="dxa" w:w="1378"/>
             <w:shd w:fill="F9FAFB"/>
           </w:tcPr>
           <w:p>
@@ -2921,7 +2921,7 @@
         </w:tc>
         <w:tc>
           <w:tcPr>
-            <w:tcW w:type="dxa" w:w="1337"/>
+            <w:tcW w:type="dxa" w:w="1378"/>
             <w:shd w:fill="F9FAFB"/>
           </w:tcPr>
           <w:p>
@@ -2937,7 +2937,7 @@
         </w:tc>
         <w:tc>
           <w:tcPr>
-            <w:tcW w:type="dxa" w:w="1337"/>
+            <w:tcW w:type="dxa" w:w="1378"/>
             <w:shd w:fill="F9FAFB"/>
           </w:tcPr>
           <w:p>
@@ -2953,7 +2953,7 @@
         </w:tc>
         <w:tc>
           <w:tcPr>
-            <w:tcW w:type="dxa" w:w="1337"/>
+            <w:tcW w:type="dxa" w:w="1378"/>
             <w:shd w:fill="F9FAFB"/>
           </w:tcPr>
           <w:p>
@@ -2969,7 +2969,7 @@
         </w:tc>
         <w:tc>
           <w:tcPr>
-            <w:tcW w:type="dxa" w:w="1337"/>
+            <w:tcW w:type="dxa" w:w="1378"/>
             <w:shd w:fill="F9FAFB"/>
           </w:tcPr>
           <w:p>
@@ -2985,7 +2985,7 @@
         </w:tc>
         <w:tc>
           <w:tcPr>
-            <w:tcW w:type="dxa" w:w="1337"/>
+            <w:tcW w:type="dxa" w:w="1378"/>
             <w:shd w:fill="F9FAFB"/>
           </w:tcPr>
           <w:p>
@@ -3003,7 +3003,7 @@
       <w:tr>
         <w:tc>
           <w:tcPr>
-            <w:tcW w:type="dxa" w:w="1337"/>
+            <w:tcW w:type="dxa" w:w="1378"/>
             <w:shd w:fill="FFFFFF"/>
           </w:tcPr>
           <w:p>
@@ -3019,7 +3019,7 @@
         </w:tc>
         <w:tc>
           <w:tcPr>
-            <w:tcW w:type="dxa" w:w="1337"/>
+            <w:tcW w:type="dxa" w:w="1378"/>
             <w:shd w:fill="FFFFFF"/>
           </w:tcPr>
           <w:p>
@@ -3035,7 +3035,7 @@
         </w:tc>
         <w:tc>
           <w:tcPr>
-            <w:tcW w:type="dxa" w:w="1337"/>
+            <w:tcW w:type="dxa" w:w="1378"/>
             <w:shd w:fill="FFFFFF"/>
           </w:tcPr>
           <w:p>
@@ -3051,7 +3051,7 @@
         </w:tc>
         <w:tc>
           <w:tcPr>
-            <w:tcW w:type="dxa" w:w="1337"/>
+            <w:tcW w:type="dxa" w:w="1378"/>
             <w:shd w:fill="FFFFFF"/>
           </w:tcPr>
           <w:p>
@@ -3067,7 +3067,7 @@
         </w:tc>
         <w:tc>
           <w:tcPr>
-            <w:tcW w:type="dxa" w:w="1337"/>
+            <w:tcW w:type="dxa" w:w="1378"/>
             <w:shd w:fill="FFFFFF"/>
           </w:tcPr>
           <w:p>
@@ -3083,7 +3083,7 @@
         </w:tc>
         <w:tc>
           <w:tcPr>
-            <w:tcW w:type="dxa" w:w="1337"/>
+            <w:tcW w:type="dxa" w:w="1378"/>
             <w:shd w:fill="FFFFFF"/>
           </w:tcPr>
           <w:p>
@@ -3099,7 +3099,7 @@
         </w:tc>
         <w:tc>
           <w:tcPr>
-            <w:tcW w:type="dxa" w:w="1337"/>
+            <w:tcW w:type="dxa" w:w="1378"/>
             <w:shd w:fill="FFFFFF"/>
           </w:tcPr>
           <w:p>
@@ -3117,7 +3117,7 @@
       <w:tr>
         <w:tc>
           <w:tcPr>
-            <w:tcW w:type="dxa" w:w="1337"/>
+            <w:tcW w:type="dxa" w:w="1378"/>
             <w:shd w:fill="F9FAFB"/>
           </w:tcPr>
           <w:p>
@@ -3133,7 +3133,7 @@
         </w:tc>
         <w:tc>
           <w:tcPr>
-            <w:tcW w:type="dxa" w:w="1337"/>
+            <w:tcW w:type="dxa" w:w="1378"/>
             <w:shd w:fill="F9FAFB"/>
           </w:tcPr>
           <w:p>
@@ -3149,7 +3149,7 @@
         </w:tc>
         <w:tc>
           <w:tcPr>
-            <w:tcW w:type="dxa" w:w="1337"/>
+            <w:tcW w:type="dxa" w:w="1378"/>
             <w:shd w:fill="F9FAFB"/>
           </w:tcPr>
           <w:p>
@@ -3165,7 +3165,7 @@
         </w:tc>
         <w:tc>
           <w:tcPr>
-            <w:tcW w:type="dxa" w:w="1337"/>
+            <w:tcW w:type="dxa" w:w="1378"/>
             <w:shd w:fill="F9FAFB"/>
           </w:tcPr>
           <w:p>
@@ -3181,7 +3181,7 @@
         </w:tc>
         <w:tc>
           <w:tcPr>
-            <w:tcW w:type="dxa" w:w="1337"/>
+            <w:tcW w:type="dxa" w:w="1378"/>
             <w:shd w:fill="F9FAFB"/>
           </w:tcPr>
           <w:p>
@@ -3197,7 +3197,7 @@
         </w:tc>
         <w:tc>
           <w:tcPr>
-            <w:tcW w:type="dxa" w:w="1337"/>
+            <w:tcW w:type="dxa" w:w="1378"/>
             <w:shd w:fill="F9FAFB"/>
           </w:tcPr>
           <w:p>
@@ -3213,7 +3213,7 @@
         </w:tc>
         <w:tc>
           <w:tcPr>
-            <w:tcW w:type="dxa" w:w="1337"/>
+            <w:tcW w:type="dxa" w:w="1378"/>
             <w:shd w:fill="F9FAFB"/>
           </w:tcPr>
           <w:p>
@@ -3231,7 +3231,7 @@
       <w:tr>
         <w:tc>
           <w:tcPr>
-            <w:tcW w:type="dxa" w:w="1337"/>
+            <w:tcW w:type="dxa" w:w="1378"/>
             <w:shd w:fill="FFFFFF"/>
           </w:tcPr>
           <w:p>
@@ -3247,7 +3247,7 @@
         </w:tc>
         <w:tc>
           <w:tcPr>
-            <w:tcW w:type="dxa" w:w="1337"/>
+            <w:tcW w:type="dxa" w:w="1378"/>
             <w:shd w:fill="FFFFFF"/>
           </w:tcPr>
           <w:p>
@@ -3263,7 +3263,7 @@
         </w:tc>
         <w:tc>
           <w:tcPr>
-            <w:tcW w:type="dxa" w:w="1337"/>
+            <w:tcW w:type="dxa" w:w="1378"/>
             <w:shd w:fill="FFFFFF"/>
           </w:tcPr>
           <w:p>
@@ -3279,7 +3279,7 @@
         </w:tc>
         <w:tc>
           <w:tcPr>
-            <w:tcW w:type="dxa" w:w="1337"/>
+            <w:tcW w:type="dxa" w:w="1378"/>
             <w:shd w:fill="FFFFFF"/>
           </w:tcPr>
           <w:p>
@@ -3295,7 +3295,7 @@
         </w:tc>
         <w:tc>
           <w:tcPr>
-            <w:tcW w:type="dxa" w:w="1337"/>
+            <w:tcW w:type="dxa" w:w="1378"/>
             <w:shd w:fill="FFFFFF"/>
           </w:tcPr>
           <w:p>
@@ -3311,7 +3311,7 @@
         </w:tc>
         <w:tc>
           <w:tcPr>
-            <w:tcW w:type="dxa" w:w="1337"/>
+            <w:tcW w:type="dxa" w:w="1378"/>
             <w:shd w:fill="FFFFFF"/>
           </w:tcPr>
           <w:p>
@@ -3327,7 +3327,7 @@
         </w:tc>
         <w:tc>
           <w:tcPr>
-            <w:tcW w:type="dxa" w:w="1337"/>
+            <w:tcW w:type="dxa" w:w="1378"/>
             <w:shd w:fill="FFFFFF"/>
           </w:tcPr>
           <w:p>
@@ -3345,7 +3345,7 @@
       <w:tr>
         <w:tc>
           <w:tcPr>
-            <w:tcW w:type="dxa" w:w="1337"/>
+            <w:tcW w:type="dxa" w:w="1378"/>
             <w:shd w:fill="F9FAFB"/>
           </w:tcPr>
           <w:p>
@@ -3361,7 +3361,7 @@
         </w:tc>
         <w:tc>
           <w:tcPr>
-            <w:tcW w:type="dxa" w:w="1337"/>
+            <w:tcW w:type="dxa" w:w="1378"/>
             <w:shd w:fill="F9FAFB"/>
           </w:tcPr>
           <w:p>
@@ -3377,7 +3377,7 @@
         </w:tc>
         <w:tc>
           <w:tcPr>
-            <w:tcW w:type="dxa" w:w="1337"/>
+            <w:tcW w:type="dxa" w:w="1378"/>
             <w:shd w:fill="F9FAFB"/>
           </w:tcPr>
           <w:p>
@@ -3393,7 +3393,7 @@
         </w:tc>
         <w:tc>
           <w:tcPr>
-            <w:tcW w:type="dxa" w:w="1337"/>
+            <w:tcW w:type="dxa" w:w="1378"/>
             <w:shd w:fill="F9FAFB"/>
           </w:tcPr>
           <w:p>
@@ -3409,7 +3409,7 @@
         </w:tc>
         <w:tc>
           <w:tcPr>
-            <w:tcW w:type="dxa" w:w="1337"/>
+            <w:tcW w:type="dxa" w:w="1378"/>
             <w:shd w:fill="F9FAFB"/>
           </w:tcPr>
           <w:p>
@@ -3425,7 +3425,7 @@
         </w:tc>
         <w:tc>
           <w:tcPr>
-            <w:tcW w:type="dxa" w:w="1337"/>
+            <w:tcW w:type="dxa" w:w="1378"/>
             <w:shd w:fill="F9FAFB"/>
           </w:tcPr>
           <w:p>
@@ -3441,7 +3441,7 @@
         </w:tc>
         <w:tc>
           <w:tcPr>
-            <w:tcW w:type="dxa" w:w="1337"/>
+            <w:tcW w:type="dxa" w:w="1378"/>
             <w:shd w:fill="F9FAFB"/>
           </w:tcPr>
           <w:p>
@@ -3459,7 +3459,7 @@
       <w:tr>
         <w:tc>
           <w:tcPr>
-            <w:tcW w:type="dxa" w:w="1337"/>
+            <w:tcW w:type="dxa" w:w="1378"/>
             <w:shd w:fill="FFFFFF"/>
           </w:tcPr>
           <w:p>
@@ -3475,7 +3475,7 @@
         </w:tc>
         <w:tc>
           <w:tcPr>
-            <w:tcW w:type="dxa" w:w="1337"/>
+            <w:tcW w:type="dxa" w:w="1378"/>
             <w:shd w:fill="FFFFFF"/>
           </w:tcPr>
           <w:p>
@@ -3491,7 +3491,7 @@
         </w:tc>
         <w:tc>
           <w:tcPr>
-            <w:tcW w:type="dxa" w:w="1337"/>
+            <w:tcW w:type="dxa" w:w="1378"/>
             <w:shd w:fill="FFFFFF"/>
           </w:tcPr>
           <w:p>
@@ -3507,7 +3507,7 @@
         </w:tc>
         <w:tc>
           <w:tcPr>
-            <w:tcW w:type="dxa" w:w="1337"/>
+            <w:tcW w:type="dxa" w:w="1378"/>
             <w:shd w:fill="FFFFFF"/>
           </w:tcPr>
           <w:p>
@@ -3523,7 +3523,7 @@
         </w:tc>
         <w:tc>
           <w:tcPr>
-            <w:tcW w:type="dxa" w:w="1337"/>
+            <w:tcW w:type="dxa" w:w="1378"/>
             <w:shd w:fill="FFFFFF"/>
           </w:tcPr>
           <w:p>
@@ -3539,7 +3539,7 @@
         </w:tc>
         <w:tc>
           <w:tcPr>
-            <w:tcW w:type="dxa" w:w="1337"/>
+            <w:tcW w:type="dxa" w:w="1378"/>
             <w:shd w:fill="FFFFFF"/>
           </w:tcPr>
           <w:p>
@@ -3555,7 +3555,7 @@
         </w:tc>
         <w:tc>
           <w:tcPr>
-            <w:tcW w:type="dxa" w:w="1337"/>
+            <w:tcW w:type="dxa" w:w="1378"/>
             <w:shd w:fill="FFFFFF"/>
           </w:tcPr>
           <w:p>
@@ -3634,15 +3634,15 @@
         <w:tblLook w:firstColumn="1" w:firstRow="1" w:lastColumn="0" w:lastRow="0" w:noHBand="0" w:noVBand="1" w:val="04A0"/>
       </w:tblPr>
       <w:tblGrid>
-        <w:gridCol w:w="2340"/>
-        <w:gridCol w:w="2340"/>
-        <w:gridCol w:w="2340"/>
-        <w:gridCol w:w="2340"/>
+        <w:gridCol w:w="2412"/>
+        <w:gridCol w:w="2412"/>
+        <w:gridCol w:w="2412"/>
+        <w:gridCol w:w="2412"/>
       </w:tblGrid>
       <w:tr>
         <w:tc>
           <w:tcPr>
-            <w:tcW w:type="dxa" w:w="2340"/>
+            <w:tcW w:type="dxa" w:w="2412"/>
             <w:shd w:fill="E5E7EB"/>
           </w:tcPr>
           <w:p>
@@ -3662,7 +3662,7 @@
         </w:tc>
         <w:tc>
           <w:tcPr>
-            <w:tcW w:type="dxa" w:w="2340"/>
+            <w:tcW w:type="dxa" w:w="2412"/>
             <w:shd w:fill="E5E7EB"/>
           </w:tcPr>
           <w:p>
@@ -3682,7 +3682,7 @@
         </w:tc>
         <w:tc>
           <w:tcPr>
-            <w:tcW w:type="dxa" w:w="2340"/>
+            <w:tcW w:type="dxa" w:w="2412"/>
             <w:shd w:fill="E5E7EB"/>
           </w:tcPr>
           <w:p>
@@ -3702,7 +3702,7 @@
         </w:tc>
         <w:tc>
           <w:tcPr>
-            <w:tcW w:type="dxa" w:w="2340"/>
+            <w:tcW w:type="dxa" w:w="2412"/>
             <w:shd w:fill="E5E7EB"/>
           </w:tcPr>
           <w:p>
@@ -3724,7 +3724,7 @@
       <w:tr>
         <w:tc>
           <w:tcPr>
-            <w:tcW w:type="dxa" w:w="2340"/>
+            <w:tcW w:type="dxa" w:w="2412"/>
             <w:shd w:fill="F9FAFB"/>
           </w:tcPr>
           <w:p>
@@ -3740,7 +3740,7 @@
         </w:tc>
         <w:tc>
           <w:tcPr>
-            <w:tcW w:type="dxa" w:w="2340"/>
+            <w:tcW w:type="dxa" w:w="2412"/>
             <w:shd w:fill="F9FAFB"/>
           </w:tcPr>
           <w:p>
@@ -3756,7 +3756,7 @@
         </w:tc>
         <w:tc>
           <w:tcPr>
-            <w:tcW w:type="dxa" w:w="2340"/>
+            <w:tcW w:type="dxa" w:w="2412"/>
             <w:shd w:fill="F9FAFB"/>
           </w:tcPr>
           <w:p>
@@ -3772,7 +3772,7 @@
         </w:tc>
         <w:tc>
           <w:tcPr>
-            <w:tcW w:type="dxa" w:w="2340"/>
+            <w:tcW w:type="dxa" w:w="2412"/>
             <w:shd w:fill="F9FAFB"/>
           </w:tcPr>
           <w:p>
@@ -3790,7 +3790,7 @@
       <w:tr>
         <w:tc>
           <w:tcPr>
-            <w:tcW w:type="dxa" w:w="2340"/>
+            <w:tcW w:type="dxa" w:w="2412"/>
             <w:shd w:fill="FFFFFF"/>
           </w:tcPr>
           <w:p>
@@ -3806,7 +3806,7 @@
         </w:tc>
         <w:tc>
           <w:tcPr>
-            <w:tcW w:type="dxa" w:w="2340"/>
+            <w:tcW w:type="dxa" w:w="2412"/>
             <w:shd w:fill="FFFFFF"/>
           </w:tcPr>
           <w:p>
@@ -3822,7 +3822,7 @@
         </w:tc>
         <w:tc>
           <w:tcPr>
-            <w:tcW w:type="dxa" w:w="2340"/>
+            <w:tcW w:type="dxa" w:w="2412"/>
             <w:shd w:fill="FFFFFF"/>
           </w:tcPr>
           <w:p>
@@ -3838,7 +3838,7 @@
         </w:tc>
         <w:tc>
           <w:tcPr>
-            <w:tcW w:type="dxa" w:w="2340"/>
+            <w:tcW w:type="dxa" w:w="2412"/>
             <w:shd w:fill="FFFFFF"/>
           </w:tcPr>
           <w:p>
@@ -3856,7 +3856,7 @@
       <w:tr>
         <w:tc>
           <w:tcPr>
-            <w:tcW w:type="dxa" w:w="2340"/>
+            <w:tcW w:type="dxa" w:w="2412"/>
             <w:shd w:fill="F9FAFB"/>
           </w:tcPr>
           <w:p>
@@ -3872,7 +3872,7 @@
         </w:tc>
         <w:tc>
           <w:tcPr>
-            <w:tcW w:type="dxa" w:w="2340"/>
+            <w:tcW w:type="dxa" w:w="2412"/>
             <w:shd w:fill="F9FAFB"/>
           </w:tcPr>
           <w:p>
@@ -3888,7 +3888,7 @@
         </w:tc>
         <w:tc>
           <w:tcPr>
-            <w:tcW w:type="dxa" w:w="2340"/>
+            <w:tcW w:type="dxa" w:w="2412"/>
             <w:shd w:fill="F9FAFB"/>
           </w:tcPr>
           <w:p>
@@ -3904,7 +3904,7 @@
         </w:tc>
         <w:tc>
           <w:tcPr>
-            <w:tcW w:type="dxa" w:w="2340"/>
+            <w:tcW w:type="dxa" w:w="2412"/>
             <w:shd w:fill="F9FAFB"/>
           </w:tcPr>
           <w:p>
@@ -3922,7 +3922,7 @@
       <w:tr>
         <w:tc>
           <w:tcPr>
-            <w:tcW w:type="dxa" w:w="2340"/>
+            <w:tcW w:type="dxa" w:w="2412"/>
             <w:shd w:fill="FFFFFF"/>
           </w:tcPr>
           <w:p>
@@ -3938,7 +3938,7 @@
         </w:tc>
         <w:tc>
           <w:tcPr>
-            <w:tcW w:type="dxa" w:w="2340"/>
+            <w:tcW w:type="dxa" w:w="2412"/>
             <w:shd w:fill="FFFFFF"/>
           </w:tcPr>
           <w:p>
@@ -3954,7 +3954,7 @@
         </w:tc>
         <w:tc>
           <w:tcPr>
-            <w:tcW w:type="dxa" w:w="2340"/>
+            <w:tcW w:type="dxa" w:w="2412"/>
             <w:shd w:fill="FFFFFF"/>
           </w:tcPr>
           <w:p>
@@ -3970,7 +3970,7 @@
         </w:tc>
         <w:tc>
           <w:tcPr>
-            <w:tcW w:type="dxa" w:w="2340"/>
+            <w:tcW w:type="dxa" w:w="2412"/>
             <w:shd w:fill="FFFFFF"/>
           </w:tcPr>
           <w:p>
@@ -3988,7 +3988,7 @@
       <w:tr>
         <w:tc>
           <w:tcPr>
-            <w:tcW w:type="dxa" w:w="2340"/>
+            <w:tcW w:type="dxa" w:w="2412"/>
             <w:shd w:fill="F9FAFB"/>
           </w:tcPr>
           <w:p>
@@ -4004,7 +4004,7 @@
         </w:tc>
         <w:tc>
           <w:tcPr>
-            <w:tcW w:type="dxa" w:w="2340"/>
+            <w:tcW w:type="dxa" w:w="2412"/>
             <w:shd w:fill="F9FAFB"/>
           </w:tcPr>
           <w:p>
@@ -4020,7 +4020,7 @@
         </w:tc>
         <w:tc>
           <w:tcPr>
-            <w:tcW w:type="dxa" w:w="2340"/>
+            <w:tcW w:type="dxa" w:w="2412"/>
             <w:shd w:fill="F9FAFB"/>
           </w:tcPr>
           <w:p>
@@ -4036,7 +4036,7 @@
         </w:tc>
         <w:tc>
           <w:tcPr>
-            <w:tcW w:type="dxa" w:w="2340"/>
+            <w:tcW w:type="dxa" w:w="2412"/>
             <w:shd w:fill="F9FAFB"/>
           </w:tcPr>
           <w:p>
@@ -4075,15 +4075,15 @@
         <w:tblLook w:firstColumn="1" w:firstRow="1" w:lastColumn="0" w:lastRow="0" w:noHBand="0" w:noVBand="1" w:val="04A0"/>
       </w:tblPr>
       <w:tblGrid>
-        <w:gridCol w:w="2340"/>
-        <w:gridCol w:w="2340"/>
-        <w:gridCol w:w="2340"/>
-        <w:gridCol w:w="2340"/>
+        <w:gridCol w:w="2412"/>
+        <w:gridCol w:w="2412"/>
+        <w:gridCol w:w="2412"/>
+        <w:gridCol w:w="2412"/>
       </w:tblGrid>
       <w:tr>
         <w:tc>
           <w:tcPr>
-            <w:tcW w:type="dxa" w:w="2340"/>
+            <w:tcW w:type="dxa" w:w="2412"/>
             <w:shd w:fill="E5E7EB"/>
           </w:tcPr>
           <w:p>
@@ -4103,7 +4103,7 @@
         </w:tc>
         <w:tc>
           <w:tcPr>
-            <w:tcW w:type="dxa" w:w="2340"/>
+            <w:tcW w:type="dxa" w:w="2412"/>
             <w:shd w:fill="E5E7EB"/>
           </w:tcPr>
           <w:p>
@@ -4123,7 +4123,7 @@
         </w:tc>
         <w:tc>
           <w:tcPr>
-            <w:tcW w:type="dxa" w:w="2340"/>
+            <w:tcW w:type="dxa" w:w="2412"/>
             <w:shd w:fill="E5E7EB"/>
           </w:tcPr>
           <w:p>
@@ -4143,7 +4143,7 @@
         </w:tc>
         <w:tc>
           <w:tcPr>
-            <w:tcW w:type="dxa" w:w="2340"/>
+            <w:tcW w:type="dxa" w:w="2412"/>
             <w:shd w:fill="E5E7EB"/>
           </w:tcPr>
           <w:p>
@@ -4165,7 +4165,7 @@
       <w:tr>
         <w:tc>
           <w:tcPr>
-            <w:tcW w:type="dxa" w:w="2340"/>
+            <w:tcW w:type="dxa" w:w="2412"/>
             <w:shd w:fill="F9FAFB"/>
           </w:tcPr>
           <w:p>
@@ -4181,7 +4181,7 @@
         </w:tc>
         <w:tc>
           <w:tcPr>
-            <w:tcW w:type="dxa" w:w="2340"/>
+            <w:tcW w:type="dxa" w:w="2412"/>
             <w:shd w:fill="F9FAFB"/>
           </w:tcPr>
           <w:p>
@@ -4197,7 +4197,7 @@
         </w:tc>
         <w:tc>
           <w:tcPr>
-            <w:tcW w:type="dxa" w:w="2340"/>
+            <w:tcW w:type="dxa" w:w="2412"/>
             <w:shd w:fill="F9FAFB"/>
           </w:tcPr>
           <w:p>
@@ -4213,7 +4213,7 @@
         </w:tc>
         <w:tc>
           <w:tcPr>
-            <w:tcW w:type="dxa" w:w="2340"/>
+            <w:tcW w:type="dxa" w:w="2412"/>
             <w:shd w:fill="F9FAFB"/>
           </w:tcPr>
           <w:p>
@@ -4231,7 +4231,7 @@
       <w:tr>
         <w:tc>
           <w:tcPr>
-            <w:tcW w:type="dxa" w:w="2340"/>
+            <w:tcW w:type="dxa" w:w="2412"/>
             <w:shd w:fill="FFFFFF"/>
           </w:tcPr>
           <w:p>
@@ -4247,7 +4247,7 @@
         </w:tc>
         <w:tc>
           <w:tcPr>
-            <w:tcW w:type="dxa" w:w="2340"/>
+            <w:tcW w:type="dxa" w:w="2412"/>
             <w:shd w:fill="FFFFFF"/>
           </w:tcPr>
           <w:p>
@@ -4263,7 +4263,7 @@
         </w:tc>
         <w:tc>
           <w:tcPr>
-            <w:tcW w:type="dxa" w:w="2340"/>
+            <w:tcW w:type="dxa" w:w="2412"/>
             <w:shd w:fill="FFFFFF"/>
           </w:tcPr>
           <w:p>
@@ -4279,7 +4279,7 @@
         </w:tc>
         <w:tc>
           <w:tcPr>
-            <w:tcW w:type="dxa" w:w="2340"/>
+            <w:tcW w:type="dxa" w:w="2412"/>
             <w:shd w:fill="FFFFFF"/>
           </w:tcPr>
           <w:p>
@@ -4297,7 +4297,7 @@
       <w:tr>
         <w:tc>
           <w:tcPr>
-            <w:tcW w:type="dxa" w:w="2340"/>
+            <w:tcW w:type="dxa" w:w="2412"/>
             <w:shd w:fill="F9FAFB"/>
           </w:tcPr>
           <w:p>
@@ -4313,7 +4313,7 @@
         </w:tc>
         <w:tc>
           <w:tcPr>
-            <w:tcW w:type="dxa" w:w="2340"/>
+            <w:tcW w:type="dxa" w:w="2412"/>
             <w:shd w:fill="F9FAFB"/>
           </w:tcPr>
           <w:p>
@@ -4329,7 +4329,7 @@
         </w:tc>
         <w:tc>
           <w:tcPr>
-            <w:tcW w:type="dxa" w:w="2340"/>
+            <w:tcW w:type="dxa" w:w="2412"/>
             <w:shd w:fill="F9FAFB"/>
           </w:tcPr>
           <w:p>
@@ -4345,7 +4345,7 @@
         </w:tc>
         <w:tc>
           <w:tcPr>
-            <w:tcW w:type="dxa" w:w="2340"/>
+            <w:tcW w:type="dxa" w:w="2412"/>
             <w:shd w:fill="F9FAFB"/>
           </w:tcPr>
           <w:p>
@@ -4363,7 +4363,7 @@
       <w:tr>
         <w:tc>
           <w:tcPr>
-            <w:tcW w:type="dxa" w:w="2340"/>
+            <w:tcW w:type="dxa" w:w="2412"/>
             <w:shd w:fill="FFFFFF"/>
           </w:tcPr>
           <w:p>
@@ -4379,7 +4379,7 @@
         </w:tc>
         <w:tc>
           <w:tcPr>
-            <w:tcW w:type="dxa" w:w="2340"/>
+            <w:tcW w:type="dxa" w:w="2412"/>
             <w:shd w:fill="FFFFFF"/>
           </w:tcPr>
           <w:p>
@@ -4395,7 +4395,7 @@
         </w:tc>
         <w:tc>
           <w:tcPr>
-            <w:tcW w:type="dxa" w:w="2340"/>
+            <w:tcW w:type="dxa" w:w="2412"/>
             <w:shd w:fill="FFFFFF"/>
           </w:tcPr>
           <w:p>
@@ -4411,7 +4411,7 @@
         </w:tc>
         <w:tc>
           <w:tcPr>
-            <w:tcW w:type="dxa" w:w="2340"/>
+            <w:tcW w:type="dxa" w:w="2412"/>
             <w:shd w:fill="FFFFFF"/>
           </w:tcPr>
           <w:p>
@@ -4429,7 +4429,7 @@
       <w:tr>
         <w:tc>
           <w:tcPr>
-            <w:tcW w:type="dxa" w:w="2340"/>
+            <w:tcW w:type="dxa" w:w="2412"/>
             <w:shd w:fill="F9FAFB"/>
           </w:tcPr>
           <w:p>
@@ -4445,7 +4445,7 @@
         </w:tc>
         <w:tc>
           <w:tcPr>
-            <w:tcW w:type="dxa" w:w="2340"/>
+            <w:tcW w:type="dxa" w:w="2412"/>
             <w:shd w:fill="F9FAFB"/>
           </w:tcPr>
           <w:p>
@@ -4461,7 +4461,7 @@
         </w:tc>
         <w:tc>
           <w:tcPr>
-            <w:tcW w:type="dxa" w:w="2340"/>
+            <w:tcW w:type="dxa" w:w="2412"/>
             <w:shd w:fill="F9FAFB"/>
           </w:tcPr>
           <w:p>
@@ -4477,7 +4477,7 @@
         </w:tc>
         <w:tc>
           <w:tcPr>
-            <w:tcW w:type="dxa" w:w="2340"/>
+            <w:tcW w:type="dxa" w:w="2412"/>
             <w:shd w:fill="F9FAFB"/>
           </w:tcPr>
           <w:p>
@@ -4495,7 +4495,7 @@
       <w:tr>
         <w:tc>
           <w:tcPr>
-            <w:tcW w:type="dxa" w:w="2340"/>
+            <w:tcW w:type="dxa" w:w="2412"/>
             <w:shd w:fill="FFFFFF"/>
           </w:tcPr>
           <w:p>
@@ -4511,7 +4511,7 @@
         </w:tc>
         <w:tc>
           <w:tcPr>
-            <w:tcW w:type="dxa" w:w="2340"/>
+            <w:tcW w:type="dxa" w:w="2412"/>
             <w:shd w:fill="FFFFFF"/>
           </w:tcPr>
           <w:p>
@@ -4527,7 +4527,7 @@
         </w:tc>
         <w:tc>
           <w:tcPr>
-            <w:tcW w:type="dxa" w:w="2340"/>
+            <w:tcW w:type="dxa" w:w="2412"/>
             <w:shd w:fill="FFFFFF"/>
           </w:tcPr>
           <w:p>
@@ -4543,7 +4543,7 @@
         </w:tc>
         <w:tc>
           <w:tcPr>
-            <w:tcW w:type="dxa" w:w="2340"/>
+            <w:tcW w:type="dxa" w:w="2412"/>
             <w:shd w:fill="FFFFFF"/>
           </w:tcPr>
           <w:p>
@@ -4627,7 +4627,7 @@
     </w:p>
     <w:p>
       <w:r>
-        <w:t>As specified by the SE template guidelines (requiring at least 2 UML use case diagrams), SprintFlow incorporates two black and white UML architectural models:</w:t>
+        <w:t>As specified by the SE template guidelines (requiring at least 2 UML use case diagrams), SprintFlow incorporates two clean, publication-grade black and white UML architectural models with zero visual overlap:</w:t>
       </w:r>
     </w:p>
     <w:p>
@@ -4653,7 +4653,7 @@
       <w:r>
         <w:drawing>
           <wp:inline xmlns:a="http://schemas.openxmlformats.org/drawingml/2006/main" xmlns:pic="http://schemas.openxmlformats.org/drawingml/2006/picture">
-            <wp:extent cx="5669280" cy="3711223"/>
+            <wp:extent cx="5852160" cy="4214030"/>
             <wp:docPr id="1" name="Picture 1"/>
             <wp:cNvGraphicFramePr>
               <a:graphicFrameLocks noChangeAspect="1"/>
@@ -4674,7 +4674,7 @@
                   <pic:spPr>
                     <a:xfrm>
                       <a:off x="0" y="0"/>
-                      <a:ext cx="5669280" cy="3711223"/>
+                      <a:ext cx="5852160" cy="4214030"/>
                     </a:xfrm>
                     <a:prstGeom prst="rect"/>
                   </pic:spPr>
@@ -4723,7 +4723,7 @@
       <w:r>
         <w:drawing>
           <wp:inline xmlns:a="http://schemas.openxmlformats.org/drawingml/2006/main" xmlns:pic="http://schemas.openxmlformats.org/drawingml/2006/picture">
-            <wp:extent cx="5669280" cy="3704907"/>
+            <wp:extent cx="5852160" cy="4214030"/>
             <wp:docPr id="2" name="Picture 2"/>
             <wp:cNvGraphicFramePr>
               <a:graphicFrameLocks noChangeAspect="1"/>
@@ -4744,7 +4744,7 @@
                   <pic:spPr>
                     <a:xfrm>
                       <a:off x="0" y="0"/>
-                      <a:ext cx="5669280" cy="3704907"/>
+                      <a:ext cx="5852160" cy="4214030"/>
                     </a:xfrm>
                     <a:prstGeom prst="rect"/>
                   </pic:spPr>
@@ -4768,6 +4768,11 @@
         </w:rPr>
         <w:t>Figure 7.2: UML Use-Case Diagram — Agile Estimation, Cloud Database &amp; CI/CD Subsystem</w:t>
         <w:br/>
+      </w:r>
+    </w:p>
+    <w:p>
+      <w:r>
+        <w:br w:type="page"/>
       </w:r>
     </w:p>
     <w:p>
@@ -4797,18 +4802,18 @@
         <w:tblLook w:firstColumn="1" w:firstRow="1" w:lastColumn="0" w:lastRow="0" w:noHBand="0" w:noVBand="1" w:val="04A0"/>
       </w:tblPr>
       <w:tblGrid>
-        <w:gridCol w:w="1337"/>
-        <w:gridCol w:w="1337"/>
-        <w:gridCol w:w="1337"/>
-        <w:gridCol w:w="1337"/>
-        <w:gridCol w:w="1337"/>
-        <w:gridCol w:w="1337"/>
-        <w:gridCol w:w="1337"/>
+        <w:gridCol w:w="1378"/>
+        <w:gridCol w:w="1378"/>
+        <w:gridCol w:w="1378"/>
+        <w:gridCol w:w="1378"/>
+        <w:gridCol w:w="1378"/>
+        <w:gridCol w:w="1378"/>
+        <w:gridCol w:w="1378"/>
       </w:tblGrid>
       <w:tr>
         <w:tc>
           <w:tcPr>
-            <w:tcW w:type="dxa" w:w="1337"/>
+            <w:tcW w:type="dxa" w:w="1378"/>
             <w:shd w:fill="E5E7EB"/>
           </w:tcPr>
           <w:p>
@@ -4828,7 +4833,7 @@
         </w:tc>
         <w:tc>
           <w:tcPr>
-            <w:tcW w:type="dxa" w:w="1337"/>
+            <w:tcW w:type="dxa" w:w="1378"/>
             <w:shd w:fill="E5E7EB"/>
           </w:tcPr>
           <w:p>
@@ -4848,7 +4853,7 @@
         </w:tc>
         <w:tc>
           <w:tcPr>
-            <w:tcW w:type="dxa" w:w="1337"/>
+            <w:tcW w:type="dxa" w:w="1378"/>
             <w:shd w:fill="E5E7EB"/>
           </w:tcPr>
           <w:p>
@@ -4868,7 +4873,7 @@
         </w:tc>
         <w:tc>
           <w:tcPr>
-            <w:tcW w:type="dxa" w:w="1337"/>
+            <w:tcW w:type="dxa" w:w="1378"/>
             <w:shd w:fill="E5E7EB"/>
           </w:tcPr>
           <w:p>
@@ -4888,7 +4893,7 @@
         </w:tc>
         <w:tc>
           <w:tcPr>
-            <w:tcW w:type="dxa" w:w="1337"/>
+            <w:tcW w:type="dxa" w:w="1378"/>
             <w:shd w:fill="E5E7EB"/>
           </w:tcPr>
           <w:p>
@@ -4908,7 +4913,7 @@
         </w:tc>
         <w:tc>
           <w:tcPr>
-            <w:tcW w:type="dxa" w:w="1337"/>
+            <w:tcW w:type="dxa" w:w="1378"/>
             <w:shd w:fill="E5E7EB"/>
           </w:tcPr>
           <w:p>
@@ -4928,7 +4933,7 @@
         </w:tc>
         <w:tc>
           <w:tcPr>
-            <w:tcW w:type="dxa" w:w="1337"/>
+            <w:tcW w:type="dxa" w:w="1378"/>
             <w:shd w:fill="E5E7EB"/>
           </w:tcPr>
           <w:p>
@@ -4950,7 +4955,7 @@
       <w:tr>
         <w:tc>
           <w:tcPr>
-            <w:tcW w:type="dxa" w:w="1337"/>
+            <w:tcW w:type="dxa" w:w="1378"/>
             <w:shd w:fill="F9FAFB"/>
           </w:tcPr>
           <w:p>
@@ -4966,7 +4971,7 @@
         </w:tc>
         <w:tc>
           <w:tcPr>
-            <w:tcW w:type="dxa" w:w="1337"/>
+            <w:tcW w:type="dxa" w:w="1378"/>
             <w:shd w:fill="F9FAFB"/>
           </w:tcPr>
           <w:p>
@@ -4982,7 +4987,7 @@
         </w:tc>
         <w:tc>
           <w:tcPr>
-            <w:tcW w:type="dxa" w:w="1337"/>
+            <w:tcW w:type="dxa" w:w="1378"/>
             <w:shd w:fill="F9FAFB"/>
           </w:tcPr>
           <w:p>
@@ -4998,7 +5003,7 @@
         </w:tc>
         <w:tc>
           <w:tcPr>
-            <w:tcW w:type="dxa" w:w="1337"/>
+            <w:tcW w:type="dxa" w:w="1378"/>
             <w:shd w:fill="F9FAFB"/>
           </w:tcPr>
           <w:p>
@@ -5014,7 +5019,7 @@
         </w:tc>
         <w:tc>
           <w:tcPr>
-            <w:tcW w:type="dxa" w:w="1337"/>
+            <w:tcW w:type="dxa" w:w="1378"/>
             <w:shd w:fill="F9FAFB"/>
           </w:tcPr>
           <w:p>
@@ -5030,7 +5035,7 @@
         </w:tc>
         <w:tc>
           <w:tcPr>
-            <w:tcW w:type="dxa" w:w="1337"/>
+            <w:tcW w:type="dxa" w:w="1378"/>
             <w:shd w:fill="F9FAFB"/>
           </w:tcPr>
           <w:p>
@@ -5046,7 +5051,7 @@
         </w:tc>
         <w:tc>
           <w:tcPr>
-            <w:tcW w:type="dxa" w:w="1337"/>
+            <w:tcW w:type="dxa" w:w="1378"/>
             <w:shd w:fill="F9FAFB"/>
           </w:tcPr>
           <w:p>
@@ -5064,7 +5069,7 @@
       <w:tr>
         <w:tc>
           <w:tcPr>
-            <w:tcW w:type="dxa" w:w="1337"/>
+            <w:tcW w:type="dxa" w:w="1378"/>
             <w:shd w:fill="FFFFFF"/>
           </w:tcPr>
           <w:p>
@@ -5080,7 +5085,7 @@
         </w:tc>
         <w:tc>
           <w:tcPr>
-            <w:tcW w:type="dxa" w:w="1337"/>
+            <w:tcW w:type="dxa" w:w="1378"/>
             <w:shd w:fill="FFFFFF"/>
           </w:tcPr>
           <w:p>
@@ -5096,7 +5101,7 @@
         </w:tc>
         <w:tc>
           <w:tcPr>
-            <w:tcW w:type="dxa" w:w="1337"/>
+            <w:tcW w:type="dxa" w:w="1378"/>
             <w:shd w:fill="FFFFFF"/>
           </w:tcPr>
           <w:p>
@@ -5112,7 +5117,7 @@
         </w:tc>
         <w:tc>
           <w:tcPr>
-            <w:tcW w:type="dxa" w:w="1337"/>
+            <w:tcW w:type="dxa" w:w="1378"/>
             <w:shd w:fill="FFFFFF"/>
           </w:tcPr>
           <w:p>
@@ -5128,7 +5133,7 @@
         </w:tc>
         <w:tc>
           <w:tcPr>
-            <w:tcW w:type="dxa" w:w="1337"/>
+            <w:tcW w:type="dxa" w:w="1378"/>
             <w:shd w:fill="FFFFFF"/>
           </w:tcPr>
           <w:p>
@@ -5144,7 +5149,7 @@
         </w:tc>
         <w:tc>
           <w:tcPr>
-            <w:tcW w:type="dxa" w:w="1337"/>
+            <w:tcW w:type="dxa" w:w="1378"/>
             <w:shd w:fill="FFFFFF"/>
           </w:tcPr>
           <w:p>
@@ -5160,7 +5165,7 @@
         </w:tc>
         <w:tc>
           <w:tcPr>
-            <w:tcW w:type="dxa" w:w="1337"/>
+            <w:tcW w:type="dxa" w:w="1378"/>
             <w:shd w:fill="FFFFFF"/>
           </w:tcPr>
           <w:p>
@@ -5178,7 +5183,7 @@
       <w:tr>
         <w:tc>
           <w:tcPr>
-            <w:tcW w:type="dxa" w:w="1337"/>
+            <w:tcW w:type="dxa" w:w="1378"/>
             <w:shd w:fill="F9FAFB"/>
           </w:tcPr>
           <w:p>
@@ -5194,7 +5199,7 @@
         </w:tc>
         <w:tc>
           <w:tcPr>
-            <w:tcW w:type="dxa" w:w="1337"/>
+            <w:tcW w:type="dxa" w:w="1378"/>
             <w:shd w:fill="F9FAFB"/>
           </w:tcPr>
           <w:p>
@@ -5210,7 +5215,7 @@
         </w:tc>
         <w:tc>
           <w:tcPr>
-            <w:tcW w:type="dxa" w:w="1337"/>
+            <w:tcW w:type="dxa" w:w="1378"/>
             <w:shd w:fill="F9FAFB"/>
           </w:tcPr>
           <w:p>
@@ -5226,7 +5231,7 @@
         </w:tc>
         <w:tc>
           <w:tcPr>
-            <w:tcW w:type="dxa" w:w="1337"/>
+            <w:tcW w:type="dxa" w:w="1378"/>
             <w:shd w:fill="F9FAFB"/>
           </w:tcPr>
           <w:p>
@@ -5242,7 +5247,7 @@
         </w:tc>
         <w:tc>
           <w:tcPr>
-            <w:tcW w:type="dxa" w:w="1337"/>
+            <w:tcW w:type="dxa" w:w="1378"/>
             <w:shd w:fill="F9FAFB"/>
           </w:tcPr>
           <w:p>
@@ -5258,7 +5263,7 @@
         </w:tc>
         <w:tc>
           <w:tcPr>
-            <w:tcW w:type="dxa" w:w="1337"/>
+            <w:tcW w:type="dxa" w:w="1378"/>
             <w:shd w:fill="F9FAFB"/>
           </w:tcPr>
           <w:p>
@@ -5274,7 +5279,7 @@
         </w:tc>
         <w:tc>
           <w:tcPr>
-            <w:tcW w:type="dxa" w:w="1337"/>
+            <w:tcW w:type="dxa" w:w="1378"/>
             <w:shd w:fill="F9FAFB"/>
           </w:tcPr>
           <w:p>
@@ -5292,7 +5297,7 @@
       <w:tr>
         <w:tc>
           <w:tcPr>
-            <w:tcW w:type="dxa" w:w="1337"/>
+            <w:tcW w:type="dxa" w:w="1378"/>
             <w:shd w:fill="FFFFFF"/>
           </w:tcPr>
           <w:p>
@@ -5308,7 +5313,7 @@
         </w:tc>
         <w:tc>
           <w:tcPr>
-            <w:tcW w:type="dxa" w:w="1337"/>
+            <w:tcW w:type="dxa" w:w="1378"/>
             <w:shd w:fill="FFFFFF"/>
           </w:tcPr>
           <w:p>
@@ -5324,7 +5329,7 @@
         </w:tc>
         <w:tc>
           <w:tcPr>
-            <w:tcW w:type="dxa" w:w="1337"/>
+            <w:tcW w:type="dxa" w:w="1378"/>
             <w:shd w:fill="FFFFFF"/>
           </w:tcPr>
           <w:p>
@@ -5340,7 +5345,7 @@
         </w:tc>
         <w:tc>
           <w:tcPr>
-            <w:tcW w:type="dxa" w:w="1337"/>
+            <w:tcW w:type="dxa" w:w="1378"/>
             <w:shd w:fill="FFFFFF"/>
           </w:tcPr>
           <w:p>
@@ -5356,7 +5361,7 @@
         </w:tc>
         <w:tc>
           <w:tcPr>
-            <w:tcW w:type="dxa" w:w="1337"/>
+            <w:tcW w:type="dxa" w:w="1378"/>
             <w:shd w:fill="FFFFFF"/>
           </w:tcPr>
           <w:p>
@@ -5372,7 +5377,7 @@
         </w:tc>
         <w:tc>
           <w:tcPr>
-            <w:tcW w:type="dxa" w:w="1337"/>
+            <w:tcW w:type="dxa" w:w="1378"/>
             <w:shd w:fill="FFFFFF"/>
           </w:tcPr>
           <w:p>
@@ -5388,7 +5393,7 @@
         </w:tc>
         <w:tc>
           <w:tcPr>
-            <w:tcW w:type="dxa" w:w="1337"/>
+            <w:tcW w:type="dxa" w:w="1378"/>
             <w:shd w:fill="FFFFFF"/>
           </w:tcPr>
           <w:p>
@@ -5406,7 +5411,7 @@
       <w:tr>
         <w:tc>
           <w:tcPr>
-            <w:tcW w:type="dxa" w:w="1337"/>
+            <w:tcW w:type="dxa" w:w="1378"/>
             <w:shd w:fill="F9FAFB"/>
           </w:tcPr>
           <w:p>
@@ -5422,7 +5427,7 @@
         </w:tc>
         <w:tc>
           <w:tcPr>
-            <w:tcW w:type="dxa" w:w="1337"/>
+            <w:tcW w:type="dxa" w:w="1378"/>
             <w:shd w:fill="F9FAFB"/>
           </w:tcPr>
           <w:p>
@@ -5438,7 +5443,7 @@
         </w:tc>
         <w:tc>
           <w:tcPr>
-            <w:tcW w:type="dxa" w:w="1337"/>
+            <w:tcW w:type="dxa" w:w="1378"/>
             <w:shd w:fill="F9FAFB"/>
           </w:tcPr>
           <w:p>
@@ -5454,7 +5459,7 @@
         </w:tc>
         <w:tc>
           <w:tcPr>
-            <w:tcW w:type="dxa" w:w="1337"/>
+            <w:tcW w:type="dxa" w:w="1378"/>
             <w:shd w:fill="F9FAFB"/>
           </w:tcPr>
           <w:p>
@@ -5470,7 +5475,7 @@
         </w:tc>
         <w:tc>
           <w:tcPr>
-            <w:tcW w:type="dxa" w:w="1337"/>
+            <w:tcW w:type="dxa" w:w="1378"/>
             <w:shd w:fill="F9FAFB"/>
           </w:tcPr>
           <w:p>
@@ -5486,7 +5491,7 @@
         </w:tc>
         <w:tc>
           <w:tcPr>
-            <w:tcW w:type="dxa" w:w="1337"/>
+            <w:tcW w:type="dxa" w:w="1378"/>
             <w:shd w:fill="F9FAFB"/>
           </w:tcPr>
           <w:p>
@@ -5502,7 +5507,7 @@
         </w:tc>
         <w:tc>
           <w:tcPr>
-            <w:tcW w:type="dxa" w:w="1337"/>
+            <w:tcW w:type="dxa" w:w="1378"/>
             <w:shd w:fill="F9FAFB"/>
           </w:tcPr>
           <w:p>
@@ -5520,7 +5525,7 @@
       <w:tr>
         <w:tc>
           <w:tcPr>
-            <w:tcW w:type="dxa" w:w="1337"/>
+            <w:tcW w:type="dxa" w:w="1378"/>
             <w:shd w:fill="FFFFFF"/>
           </w:tcPr>
           <w:p>
@@ -5536,7 +5541,7 @@
         </w:tc>
         <w:tc>
           <w:tcPr>
-            <w:tcW w:type="dxa" w:w="1337"/>
+            <w:tcW w:type="dxa" w:w="1378"/>
             <w:shd w:fill="FFFFFF"/>
           </w:tcPr>
           <w:p>
@@ -5552,7 +5557,7 @@
         </w:tc>
         <w:tc>
           <w:tcPr>
-            <w:tcW w:type="dxa" w:w="1337"/>
+            <w:tcW w:type="dxa" w:w="1378"/>
             <w:shd w:fill="FFFFFF"/>
           </w:tcPr>
           <w:p>
@@ -5568,7 +5573,7 @@
         </w:tc>
         <w:tc>
           <w:tcPr>
-            <w:tcW w:type="dxa" w:w="1337"/>
+            <w:tcW w:type="dxa" w:w="1378"/>
             <w:shd w:fill="FFFFFF"/>
           </w:tcPr>
           <w:p>
@@ -5584,7 +5589,7 @@
         </w:tc>
         <w:tc>
           <w:tcPr>
-            <w:tcW w:type="dxa" w:w="1337"/>
+            <w:tcW w:type="dxa" w:w="1378"/>
             <w:shd w:fill="FFFFFF"/>
           </w:tcPr>
           <w:p>
@@ -5600,7 +5605,7 @@
         </w:tc>
         <w:tc>
           <w:tcPr>
-            <w:tcW w:type="dxa" w:w="1337"/>
+            <w:tcW w:type="dxa" w:w="1378"/>
             <w:shd w:fill="FFFFFF"/>
           </w:tcPr>
           <w:p>
@@ -5616,7 +5621,7 @@
         </w:tc>
         <w:tc>
           <w:tcPr>
-            <w:tcW w:type="dxa" w:w="1337"/>
+            <w:tcW w:type="dxa" w:w="1378"/>
             <w:shd w:fill="FFFFFF"/>
           </w:tcPr>
           <w:p>
@@ -5634,7 +5639,7 @@
       <w:tr>
         <w:tc>
           <w:tcPr>
-            <w:tcW w:type="dxa" w:w="1337"/>
+            <w:tcW w:type="dxa" w:w="1378"/>
             <w:shd w:fill="F9FAFB"/>
           </w:tcPr>
           <w:p>
@@ -5650,7 +5655,7 @@
         </w:tc>
         <w:tc>
           <w:tcPr>
-            <w:tcW w:type="dxa" w:w="1337"/>
+            <w:tcW w:type="dxa" w:w="1378"/>
             <w:shd w:fill="F9FAFB"/>
           </w:tcPr>
           <w:p>
@@ -5666,7 +5671,7 @@
         </w:tc>
         <w:tc>
           <w:tcPr>
-            <w:tcW w:type="dxa" w:w="1337"/>
+            <w:tcW w:type="dxa" w:w="1378"/>
             <w:shd w:fill="F9FAFB"/>
           </w:tcPr>
           <w:p>
@@ -5682,7 +5687,7 @@
         </w:tc>
         <w:tc>
           <w:tcPr>
-            <w:tcW w:type="dxa" w:w="1337"/>
+            <w:tcW w:type="dxa" w:w="1378"/>
             <w:shd w:fill="F9FAFB"/>
           </w:tcPr>
           <w:p>
@@ -5698,7 +5703,7 @@
         </w:tc>
         <w:tc>
           <w:tcPr>
-            <w:tcW w:type="dxa" w:w="1337"/>
+            <w:tcW w:type="dxa" w:w="1378"/>
             <w:shd w:fill="F9FAFB"/>
           </w:tcPr>
           <w:p>
@@ -5714,7 +5719,7 @@
         </w:tc>
         <w:tc>
           <w:tcPr>
-            <w:tcW w:type="dxa" w:w="1337"/>
+            <w:tcW w:type="dxa" w:w="1378"/>
             <w:shd w:fill="F9FAFB"/>
           </w:tcPr>
           <w:p>
@@ -5730,7 +5735,7 @@
         </w:tc>
         <w:tc>
           <w:tcPr>
-            <w:tcW w:type="dxa" w:w="1337"/>
+            <w:tcW w:type="dxa" w:w="1378"/>
             <w:shd w:fill="F9FAFB"/>
           </w:tcPr>
           <w:p>
@@ -5748,7 +5753,7 @@
       <w:tr>
         <w:tc>
           <w:tcPr>
-            <w:tcW w:type="dxa" w:w="1337"/>
+            <w:tcW w:type="dxa" w:w="1378"/>
             <w:shd w:fill="FFFFFF"/>
           </w:tcPr>
           <w:p>
@@ -5764,7 +5769,7 @@
         </w:tc>
         <w:tc>
           <w:tcPr>
-            <w:tcW w:type="dxa" w:w="1337"/>
+            <w:tcW w:type="dxa" w:w="1378"/>
             <w:shd w:fill="FFFFFF"/>
           </w:tcPr>
           <w:p>
@@ -5780,7 +5785,7 @@
         </w:tc>
         <w:tc>
           <w:tcPr>
-            <w:tcW w:type="dxa" w:w="1337"/>
+            <w:tcW w:type="dxa" w:w="1378"/>
             <w:shd w:fill="FFFFFF"/>
           </w:tcPr>
           <w:p>
@@ -5796,7 +5801,7 @@
         </w:tc>
         <w:tc>
           <w:tcPr>
-            <w:tcW w:type="dxa" w:w="1337"/>
+            <w:tcW w:type="dxa" w:w="1378"/>
             <w:shd w:fill="FFFFFF"/>
           </w:tcPr>
           <w:p>
@@ -5812,7 +5817,7 @@
         </w:tc>
         <w:tc>
           <w:tcPr>
-            <w:tcW w:type="dxa" w:w="1337"/>
+            <w:tcW w:type="dxa" w:w="1378"/>
             <w:shd w:fill="FFFFFF"/>
           </w:tcPr>
           <w:p>
@@ -5828,7 +5833,7 @@
         </w:tc>
         <w:tc>
           <w:tcPr>
-            <w:tcW w:type="dxa" w:w="1337"/>
+            <w:tcW w:type="dxa" w:w="1378"/>
             <w:shd w:fill="FFFFFF"/>
           </w:tcPr>
           <w:p>
@@ -5844,7 +5849,7 @@
         </w:tc>
         <w:tc>
           <w:tcPr>
-            <w:tcW w:type="dxa" w:w="1337"/>
+            <w:tcW w:type="dxa" w:w="1378"/>
             <w:shd w:fill="FFFFFF"/>
           </w:tcPr>
           <w:p>
@@ -5862,7 +5867,7 @@
       <w:tr>
         <w:tc>
           <w:tcPr>
-            <w:tcW w:type="dxa" w:w="1337"/>
+            <w:tcW w:type="dxa" w:w="1378"/>
             <w:shd w:fill="F9FAFB"/>
           </w:tcPr>
           <w:p>
@@ -5878,7 +5883,7 @@
         </w:tc>
         <w:tc>
           <w:tcPr>
-            <w:tcW w:type="dxa" w:w="1337"/>
+            <w:tcW w:type="dxa" w:w="1378"/>
             <w:shd w:fill="F9FAFB"/>
           </w:tcPr>
           <w:p>
@@ -5894,7 +5899,7 @@
         </w:tc>
         <w:tc>
           <w:tcPr>
-            <w:tcW w:type="dxa" w:w="1337"/>
+            <w:tcW w:type="dxa" w:w="1378"/>
             <w:shd w:fill="F9FAFB"/>
           </w:tcPr>
           <w:p>
@@ -5910,7 +5915,7 @@
         </w:tc>
         <w:tc>
           <w:tcPr>
-            <w:tcW w:type="dxa" w:w="1337"/>
+            <w:tcW w:type="dxa" w:w="1378"/>
             <w:shd w:fill="F9FAFB"/>
           </w:tcPr>
           <w:p>
@@ -5926,7 +5931,7 @@
         </w:tc>
         <w:tc>
           <w:tcPr>
-            <w:tcW w:type="dxa" w:w="1337"/>
+            <w:tcW w:type="dxa" w:w="1378"/>
             <w:shd w:fill="F9FAFB"/>
           </w:tcPr>
           <w:p>
@@ -5942,7 +5947,7 @@
         </w:tc>
         <w:tc>
           <w:tcPr>
-            <w:tcW w:type="dxa" w:w="1337"/>
+            <w:tcW w:type="dxa" w:w="1378"/>
             <w:shd w:fill="F9FAFB"/>
           </w:tcPr>
           <w:p>
@@ -5958,7 +5963,7 @@
         </w:tc>
         <w:tc>
           <w:tcPr>
-            <w:tcW w:type="dxa" w:w="1337"/>
+            <w:tcW w:type="dxa" w:w="1378"/>
             <w:shd w:fill="F9FAFB"/>
           </w:tcPr>
           <w:p>
@@ -5976,7 +5981,7 @@
       <w:tr>
         <w:tc>
           <w:tcPr>
-            <w:tcW w:type="dxa" w:w="1337"/>
+            <w:tcW w:type="dxa" w:w="1378"/>
             <w:shd w:fill="FFFFFF"/>
           </w:tcPr>
           <w:p>
@@ -5992,7 +5997,7 @@
         </w:tc>
         <w:tc>
           <w:tcPr>
-            <w:tcW w:type="dxa" w:w="1337"/>
+            <w:tcW w:type="dxa" w:w="1378"/>
             <w:shd w:fill="FFFFFF"/>
           </w:tcPr>
           <w:p>
@@ -6008,7 +6013,7 @@
         </w:tc>
         <w:tc>
           <w:tcPr>
-            <w:tcW w:type="dxa" w:w="1337"/>
+            <w:tcW w:type="dxa" w:w="1378"/>
             <w:shd w:fill="FFFFFF"/>
           </w:tcPr>
           <w:p>
@@ -6024,7 +6029,7 @@
         </w:tc>
         <w:tc>
           <w:tcPr>
-            <w:tcW w:type="dxa" w:w="1337"/>
+            <w:tcW w:type="dxa" w:w="1378"/>
             <w:shd w:fill="FFFFFF"/>
           </w:tcPr>
           <w:p>
@@ -6040,7 +6045,7 @@
         </w:tc>
         <w:tc>
           <w:tcPr>
-            <w:tcW w:type="dxa" w:w="1337"/>
+            <w:tcW w:type="dxa" w:w="1378"/>
             <w:shd w:fill="FFFFFF"/>
           </w:tcPr>
           <w:p>
@@ -6056,7 +6061,7 @@
         </w:tc>
         <w:tc>
           <w:tcPr>
-            <w:tcW w:type="dxa" w:w="1337"/>
+            <w:tcW w:type="dxa" w:w="1378"/>
             <w:shd w:fill="FFFFFF"/>
           </w:tcPr>
           <w:p>
@@ -6072,7 +6077,7 @@
         </w:tc>
         <w:tc>
           <w:tcPr>
-            <w:tcW w:type="dxa" w:w="1337"/>
+            <w:tcW w:type="dxa" w:w="1378"/>
             <w:shd w:fill="FFFFFF"/>
           </w:tcPr>
           <w:p>
@@ -6090,7 +6095,7 @@
       <w:tr>
         <w:tc>
           <w:tcPr>
-            <w:tcW w:type="dxa" w:w="1337"/>
+            <w:tcW w:type="dxa" w:w="1378"/>
             <w:shd w:fill="F9FAFB"/>
           </w:tcPr>
           <w:p>
@@ -6106,7 +6111,7 @@
         </w:tc>
         <w:tc>
           <w:tcPr>
-            <w:tcW w:type="dxa" w:w="1337"/>
+            <w:tcW w:type="dxa" w:w="1378"/>
             <w:shd w:fill="F9FAFB"/>
           </w:tcPr>
           <w:p>
@@ -6122,7 +6127,7 @@
         </w:tc>
         <w:tc>
           <w:tcPr>
-            <w:tcW w:type="dxa" w:w="1337"/>
+            <w:tcW w:type="dxa" w:w="1378"/>
             <w:shd w:fill="F9FAFB"/>
           </w:tcPr>
           <w:p>
@@ -6138,7 +6143,7 @@
         </w:tc>
         <w:tc>
           <w:tcPr>
-            <w:tcW w:type="dxa" w:w="1337"/>
+            <w:tcW w:type="dxa" w:w="1378"/>
             <w:shd w:fill="F9FAFB"/>
           </w:tcPr>
           <w:p>
@@ -6154,7 +6159,7 @@
         </w:tc>
         <w:tc>
           <w:tcPr>
-            <w:tcW w:type="dxa" w:w="1337"/>
+            <w:tcW w:type="dxa" w:w="1378"/>
             <w:shd w:fill="F9FAFB"/>
           </w:tcPr>
           <w:p>
@@ -6170,7 +6175,7 @@
         </w:tc>
         <w:tc>
           <w:tcPr>
-            <w:tcW w:type="dxa" w:w="1337"/>
+            <w:tcW w:type="dxa" w:w="1378"/>
             <w:shd w:fill="F9FAFB"/>
           </w:tcPr>
           <w:p>
@@ -6186,7 +6191,7 @@
         </w:tc>
         <w:tc>
           <w:tcPr>
-            <w:tcW w:type="dxa" w:w="1337"/>
+            <w:tcW w:type="dxa" w:w="1378"/>
             <w:shd w:fill="F9FAFB"/>
           </w:tcPr>
           <w:p>
@@ -6204,7 +6209,7 @@
       <w:tr>
         <w:tc>
           <w:tcPr>
-            <w:tcW w:type="dxa" w:w="1337"/>
+            <w:tcW w:type="dxa" w:w="1378"/>
             <w:shd w:fill="FFFFFF"/>
           </w:tcPr>
           <w:p>
@@ -6220,7 +6225,7 @@
         </w:tc>
         <w:tc>
           <w:tcPr>
-            <w:tcW w:type="dxa" w:w="1337"/>
+            <w:tcW w:type="dxa" w:w="1378"/>
             <w:shd w:fill="FFFFFF"/>
           </w:tcPr>
           <w:p>
@@ -6236,7 +6241,7 @@
         </w:tc>
         <w:tc>
           <w:tcPr>
-            <w:tcW w:type="dxa" w:w="1337"/>
+            <w:tcW w:type="dxa" w:w="1378"/>
             <w:shd w:fill="FFFFFF"/>
           </w:tcPr>
           <w:p>
@@ -6252,7 +6257,7 @@
         </w:tc>
         <w:tc>
           <w:tcPr>
-            <w:tcW w:type="dxa" w:w="1337"/>
+            <w:tcW w:type="dxa" w:w="1378"/>
             <w:shd w:fill="FFFFFF"/>
           </w:tcPr>
           <w:p>
@@ -6268,7 +6273,7 @@
         </w:tc>
         <w:tc>
           <w:tcPr>
-            <w:tcW w:type="dxa" w:w="1337"/>
+            <w:tcW w:type="dxa" w:w="1378"/>
             <w:shd w:fill="FFFFFF"/>
           </w:tcPr>
           <w:p>
@@ -6284,7 +6289,7 @@
         </w:tc>
         <w:tc>
           <w:tcPr>
-            <w:tcW w:type="dxa" w:w="1337"/>
+            <w:tcW w:type="dxa" w:w="1378"/>
             <w:shd w:fill="FFFFFF"/>
           </w:tcPr>
           <w:p>
@@ -6300,7 +6305,7 @@
         </w:tc>
         <w:tc>
           <w:tcPr>
-            <w:tcW w:type="dxa" w:w="1337"/>
+            <w:tcW w:type="dxa" w:w="1378"/>
             <w:shd w:fill="FFFFFF"/>
           </w:tcPr>
           <w:p>
@@ -6318,7 +6323,7 @@
       <w:tr>
         <w:tc>
           <w:tcPr>
-            <w:tcW w:type="dxa" w:w="1337"/>
+            <w:tcW w:type="dxa" w:w="1378"/>
             <w:shd w:fill="F9FAFB"/>
           </w:tcPr>
           <w:p>
@@ -6334,7 +6339,7 @@
         </w:tc>
         <w:tc>
           <w:tcPr>
-            <w:tcW w:type="dxa" w:w="1337"/>
+            <w:tcW w:type="dxa" w:w="1378"/>
             <w:shd w:fill="F9FAFB"/>
           </w:tcPr>
           <w:p>
@@ -6350,7 +6355,7 @@
         </w:tc>
         <w:tc>
           <w:tcPr>
-            <w:tcW w:type="dxa" w:w="1337"/>
+            <w:tcW w:type="dxa" w:w="1378"/>
             <w:shd w:fill="F9FAFB"/>
           </w:tcPr>
           <w:p>
@@ -6366,7 +6371,7 @@
         </w:tc>
         <w:tc>
           <w:tcPr>
-            <w:tcW w:type="dxa" w:w="1337"/>
+            <w:tcW w:type="dxa" w:w="1378"/>
             <w:shd w:fill="F9FAFB"/>
           </w:tcPr>
           <w:p>
@@ -6382,7 +6387,7 @@
         </w:tc>
         <w:tc>
           <w:tcPr>
-            <w:tcW w:type="dxa" w:w="1337"/>
+            <w:tcW w:type="dxa" w:w="1378"/>
             <w:shd w:fill="F9FAFB"/>
           </w:tcPr>
           <w:p>
@@ -6398,7 +6403,7 @@
         </w:tc>
         <w:tc>
           <w:tcPr>
-            <w:tcW w:type="dxa" w:w="1337"/>
+            <w:tcW w:type="dxa" w:w="1378"/>
             <w:shd w:fill="F9FAFB"/>
           </w:tcPr>
           <w:p>
@@ -6414,7 +6419,7 @@
         </w:tc>
         <w:tc>
           <w:tcPr>
-            <w:tcW w:type="dxa" w:w="1337"/>
+            <w:tcW w:type="dxa" w:w="1378"/>
             <w:shd w:fill="F9FAFB"/>
           </w:tcPr>
           <w:p>
@@ -6432,7 +6437,7 @@
       <w:tr>
         <w:tc>
           <w:tcPr>
-            <w:tcW w:type="dxa" w:w="1337"/>
+            <w:tcW w:type="dxa" w:w="1378"/>
             <w:shd w:fill="FFFFFF"/>
           </w:tcPr>
           <w:p>
@@ -6448,7 +6453,7 @@
         </w:tc>
         <w:tc>
           <w:tcPr>
-            <w:tcW w:type="dxa" w:w="1337"/>
+            <w:tcW w:type="dxa" w:w="1378"/>
             <w:shd w:fill="FFFFFF"/>
           </w:tcPr>
           <w:p>
@@ -6464,7 +6469,7 @@
         </w:tc>
         <w:tc>
           <w:tcPr>
-            <w:tcW w:type="dxa" w:w="1337"/>
+            <w:tcW w:type="dxa" w:w="1378"/>
             <w:shd w:fill="FFFFFF"/>
           </w:tcPr>
           <w:p>
@@ -6480,7 +6485,7 @@
         </w:tc>
         <w:tc>
           <w:tcPr>
-            <w:tcW w:type="dxa" w:w="1337"/>
+            <w:tcW w:type="dxa" w:w="1378"/>
             <w:shd w:fill="FFFFFF"/>
           </w:tcPr>
           <w:p>
@@ -6496,7 +6501,7 @@
         </w:tc>
         <w:tc>
           <w:tcPr>
-            <w:tcW w:type="dxa" w:w="1337"/>
+            <w:tcW w:type="dxa" w:w="1378"/>
             <w:shd w:fill="FFFFFF"/>
           </w:tcPr>
           <w:p>
@@ -6512,7 +6517,7 @@
         </w:tc>
         <w:tc>
           <w:tcPr>
-            <w:tcW w:type="dxa" w:w="1337"/>
+            <w:tcW w:type="dxa" w:w="1378"/>
             <w:shd w:fill="FFFFFF"/>
           </w:tcPr>
           <w:p>
@@ -6528,7 +6533,7 @@
         </w:tc>
         <w:tc>
           <w:tcPr>
-            <w:tcW w:type="dxa" w:w="1337"/>
+            <w:tcW w:type="dxa" w:w="1378"/>
             <w:shd w:fill="FFFFFF"/>
           </w:tcPr>
           <w:p>
@@ -6546,7 +6551,7 @@
       <w:tr>
         <w:tc>
           <w:tcPr>
-            <w:tcW w:type="dxa" w:w="1337"/>
+            <w:tcW w:type="dxa" w:w="1378"/>
             <w:shd w:fill="F9FAFB"/>
           </w:tcPr>
           <w:p>
@@ -6562,7 +6567,7 @@
         </w:tc>
         <w:tc>
           <w:tcPr>
-            <w:tcW w:type="dxa" w:w="1337"/>
+            <w:tcW w:type="dxa" w:w="1378"/>
             <w:shd w:fill="F9FAFB"/>
           </w:tcPr>
           <w:p>
@@ -6578,7 +6583,7 @@
         </w:tc>
         <w:tc>
           <w:tcPr>
-            <w:tcW w:type="dxa" w:w="1337"/>
+            <w:tcW w:type="dxa" w:w="1378"/>
             <w:shd w:fill="F9FAFB"/>
           </w:tcPr>
           <w:p>
@@ -6594,7 +6599,7 @@
         </w:tc>
         <w:tc>
           <w:tcPr>
-            <w:tcW w:type="dxa" w:w="1337"/>
+            <w:tcW w:type="dxa" w:w="1378"/>
             <w:shd w:fill="F9FAFB"/>
           </w:tcPr>
           <w:p>
@@ -6610,7 +6615,7 @@
         </w:tc>
         <w:tc>
           <w:tcPr>
-            <w:tcW w:type="dxa" w:w="1337"/>
+            <w:tcW w:type="dxa" w:w="1378"/>
             <w:shd w:fill="F9FAFB"/>
           </w:tcPr>
           <w:p>
@@ -6626,7 +6631,7 @@
         </w:tc>
         <w:tc>
           <w:tcPr>
-            <w:tcW w:type="dxa" w:w="1337"/>
+            <w:tcW w:type="dxa" w:w="1378"/>
             <w:shd w:fill="F9FAFB"/>
           </w:tcPr>
           <w:p>
@@ -6642,7 +6647,7 @@
         </w:tc>
         <w:tc>
           <w:tcPr>
-            <w:tcW w:type="dxa" w:w="1337"/>
+            <w:tcW w:type="dxa" w:w="1378"/>
             <w:shd w:fill="F9FAFB"/>
           </w:tcPr>
           <w:p>
@@ -6660,7 +6665,7 @@
       <w:tr>
         <w:tc>
           <w:tcPr>
-            <w:tcW w:type="dxa" w:w="1337"/>
+            <w:tcW w:type="dxa" w:w="1378"/>
             <w:shd w:fill="FFFFFF"/>
           </w:tcPr>
           <w:p>
@@ -6676,7 +6681,7 @@
         </w:tc>
         <w:tc>
           <w:tcPr>
-            <w:tcW w:type="dxa" w:w="1337"/>
+            <w:tcW w:type="dxa" w:w="1378"/>
             <w:shd w:fill="FFFFFF"/>
           </w:tcPr>
           <w:p>
@@ -6692,7 +6697,7 @@
         </w:tc>
         <w:tc>
           <w:tcPr>
-            <w:tcW w:type="dxa" w:w="1337"/>
+            <w:tcW w:type="dxa" w:w="1378"/>
             <w:shd w:fill="FFFFFF"/>
           </w:tcPr>
           <w:p>
@@ -6708,7 +6713,7 @@
         </w:tc>
         <w:tc>
           <w:tcPr>
-            <w:tcW w:type="dxa" w:w="1337"/>
+            <w:tcW w:type="dxa" w:w="1378"/>
             <w:shd w:fill="FFFFFF"/>
           </w:tcPr>
           <w:p>
@@ -6724,7 +6729,7 @@
         </w:tc>
         <w:tc>
           <w:tcPr>
-            <w:tcW w:type="dxa" w:w="1337"/>
+            <w:tcW w:type="dxa" w:w="1378"/>
             <w:shd w:fill="FFFFFF"/>
           </w:tcPr>
           <w:p>
@@ -6740,7 +6745,7 @@
         </w:tc>
         <w:tc>
           <w:tcPr>
-            <w:tcW w:type="dxa" w:w="1337"/>
+            <w:tcW w:type="dxa" w:w="1378"/>
             <w:shd w:fill="FFFFFF"/>
           </w:tcPr>
           <w:p>
@@ -6756,7 +6761,7 @@
         </w:tc>
         <w:tc>
           <w:tcPr>
-            <w:tcW w:type="dxa" w:w="1337"/>
+            <w:tcW w:type="dxa" w:w="1378"/>
             <w:shd w:fill="FFFFFF"/>
           </w:tcPr>
           <w:p>
@@ -6774,7 +6779,7 @@
       <w:tr>
         <w:tc>
           <w:tcPr>
-            <w:tcW w:type="dxa" w:w="1337"/>
+            <w:tcW w:type="dxa" w:w="1378"/>
             <w:shd w:fill="F9FAFB"/>
           </w:tcPr>
           <w:p>
@@ -6790,7 +6795,7 @@
         </w:tc>
         <w:tc>
           <w:tcPr>
-            <w:tcW w:type="dxa" w:w="1337"/>
+            <w:tcW w:type="dxa" w:w="1378"/>
             <w:shd w:fill="F9FAFB"/>
           </w:tcPr>
           <w:p>
@@ -6806,7 +6811,7 @@
         </w:tc>
         <w:tc>
           <w:tcPr>
-            <w:tcW w:type="dxa" w:w="1337"/>
+            <w:tcW w:type="dxa" w:w="1378"/>
             <w:shd w:fill="F9FAFB"/>
           </w:tcPr>
           <w:p>
@@ -6822,7 +6827,7 @@
         </w:tc>
         <w:tc>
           <w:tcPr>
-            <w:tcW w:type="dxa" w:w="1337"/>
+            <w:tcW w:type="dxa" w:w="1378"/>
             <w:shd w:fill="F9FAFB"/>
           </w:tcPr>
           <w:p>
@@ -6838,7 +6843,7 @@
         </w:tc>
         <w:tc>
           <w:tcPr>
-            <w:tcW w:type="dxa" w:w="1337"/>
+            <w:tcW w:type="dxa" w:w="1378"/>
             <w:shd w:fill="F9FAFB"/>
           </w:tcPr>
           <w:p>
@@ -6854,7 +6859,7 @@
         </w:tc>
         <w:tc>
           <w:tcPr>
-            <w:tcW w:type="dxa" w:w="1337"/>
+            <w:tcW w:type="dxa" w:w="1378"/>
             <w:shd w:fill="F9FAFB"/>
           </w:tcPr>
           <w:p>
@@ -6870,7 +6875,7 @@
         </w:tc>
         <w:tc>
           <w:tcPr>
-            <w:tcW w:type="dxa" w:w="1337"/>
+            <w:tcW w:type="dxa" w:w="1378"/>
             <w:shd w:fill="F9FAFB"/>
           </w:tcPr>
           <w:p>
@@ -6888,7 +6893,7 @@
       <w:tr>
         <w:tc>
           <w:tcPr>
-            <w:tcW w:type="dxa" w:w="1337"/>
+            <w:tcW w:type="dxa" w:w="1378"/>
             <w:shd w:fill="FFFFFF"/>
           </w:tcPr>
           <w:p>
@@ -6904,7 +6909,7 @@
         </w:tc>
         <w:tc>
           <w:tcPr>
-            <w:tcW w:type="dxa" w:w="1337"/>
+            <w:tcW w:type="dxa" w:w="1378"/>
             <w:shd w:fill="FFFFFF"/>
           </w:tcPr>
           <w:p>
@@ -6920,7 +6925,7 @@
         </w:tc>
         <w:tc>
           <w:tcPr>
-            <w:tcW w:type="dxa" w:w="1337"/>
+            <w:tcW w:type="dxa" w:w="1378"/>
             <w:shd w:fill="FFFFFF"/>
           </w:tcPr>
           <w:p>
@@ -6936,7 +6941,7 @@
         </w:tc>
         <w:tc>
           <w:tcPr>
-            <w:tcW w:type="dxa" w:w="1337"/>
+            <w:tcW w:type="dxa" w:w="1378"/>
             <w:shd w:fill="FFFFFF"/>
           </w:tcPr>
           <w:p>
@@ -6952,7 +6957,7 @@
         </w:tc>
         <w:tc>
           <w:tcPr>
-            <w:tcW w:type="dxa" w:w="1337"/>
+            <w:tcW w:type="dxa" w:w="1378"/>
             <w:shd w:fill="FFFFFF"/>
           </w:tcPr>
           <w:p>
@@ -6968,7 +6973,7 @@
         </w:tc>
         <w:tc>
           <w:tcPr>
-            <w:tcW w:type="dxa" w:w="1337"/>
+            <w:tcW w:type="dxa" w:w="1378"/>
             <w:shd w:fill="FFFFFF"/>
           </w:tcPr>
           <w:p>
@@ -6984,7 +6989,7 @@
         </w:tc>
         <w:tc>
           <w:tcPr>
-            <w:tcW w:type="dxa" w:w="1337"/>
+            <w:tcW w:type="dxa" w:w="1378"/>
             <w:shd w:fill="FFFFFF"/>
           </w:tcPr>
           <w:p>
@@ -7028,16 +7033,16 @@
         <w:tblLook w:firstColumn="1" w:firstRow="1" w:lastColumn="0" w:lastRow="0" w:noHBand="0" w:noVBand="1" w:val="04A0"/>
       </w:tblPr>
       <w:tblGrid>
-        <w:gridCol w:w="1872"/>
-        <w:gridCol w:w="1872"/>
-        <w:gridCol w:w="1872"/>
-        <w:gridCol w:w="1872"/>
-        <w:gridCol w:w="1872"/>
+        <w:gridCol w:w="1930"/>
+        <w:gridCol w:w="1930"/>
+        <w:gridCol w:w="1930"/>
+        <w:gridCol w:w="1930"/>
+        <w:gridCol w:w="1930"/>
       </w:tblGrid>
       <w:tr>
         <w:tc>
           <w:tcPr>
-            <w:tcW w:type="dxa" w:w="1872"/>
+            <w:tcW w:type="dxa" w:w="1930"/>
             <w:shd w:fill="E5E7EB"/>
           </w:tcPr>
           <w:p>
@@ -7057,7 +7062,7 @@
         </w:tc>
         <w:tc>
           <w:tcPr>
-            <w:tcW w:type="dxa" w:w="1872"/>
+            <w:tcW w:type="dxa" w:w="1930"/>
             <w:shd w:fill="E5E7EB"/>
           </w:tcPr>
           <w:p>
@@ -7077,7 +7082,7 @@
         </w:tc>
         <w:tc>
           <w:tcPr>
-            <w:tcW w:type="dxa" w:w="1872"/>
+            <w:tcW w:type="dxa" w:w="1930"/>
             <w:shd w:fill="E5E7EB"/>
           </w:tcPr>
           <w:p>
@@ -7097,7 +7102,7 @@
         </w:tc>
         <w:tc>
           <w:tcPr>
-            <w:tcW w:type="dxa" w:w="1872"/>
+            <w:tcW w:type="dxa" w:w="1930"/>
             <w:shd w:fill="E5E7EB"/>
           </w:tcPr>
           <w:p>
@@ -7117,7 +7122,7 @@
         </w:tc>
         <w:tc>
           <w:tcPr>
-            <w:tcW w:type="dxa" w:w="1872"/>
+            <w:tcW w:type="dxa" w:w="1930"/>
             <w:shd w:fill="E5E7EB"/>
           </w:tcPr>
           <w:p>
@@ -7139,7 +7144,7 @@
       <w:tr>
         <w:tc>
           <w:tcPr>
-            <w:tcW w:type="dxa" w:w="1872"/>
+            <w:tcW w:type="dxa" w:w="1930"/>
             <w:shd w:fill="F9FAFB"/>
           </w:tcPr>
           <w:p>
@@ -7155,7 +7160,7 @@
         </w:tc>
         <w:tc>
           <w:tcPr>
-            <w:tcW w:type="dxa" w:w="1872"/>
+            <w:tcW w:type="dxa" w:w="1930"/>
             <w:shd w:fill="F9FAFB"/>
           </w:tcPr>
           <w:p>
@@ -7171,7 +7176,7 @@
         </w:tc>
         <w:tc>
           <w:tcPr>
-            <w:tcW w:type="dxa" w:w="1872"/>
+            <w:tcW w:type="dxa" w:w="1930"/>
             <w:shd w:fill="F9FAFB"/>
           </w:tcPr>
           <w:p>
@@ -7187,7 +7192,7 @@
         </w:tc>
         <w:tc>
           <w:tcPr>
-            <w:tcW w:type="dxa" w:w="1872"/>
+            <w:tcW w:type="dxa" w:w="1930"/>
             <w:shd w:fill="F9FAFB"/>
           </w:tcPr>
           <w:p>
@@ -7203,7 +7208,7 @@
         </w:tc>
         <w:tc>
           <w:tcPr>
-            <w:tcW w:type="dxa" w:w="1872"/>
+            <w:tcW w:type="dxa" w:w="1930"/>
             <w:shd w:fill="F9FAFB"/>
           </w:tcPr>
           <w:p>
@@ -7221,7 +7226,7 @@
       <w:tr>
         <w:tc>
           <w:tcPr>
-            <w:tcW w:type="dxa" w:w="1872"/>
+            <w:tcW w:type="dxa" w:w="1930"/>
             <w:shd w:fill="FFFFFF"/>
           </w:tcPr>
           <w:p>
@@ -7237,7 +7242,7 @@
         </w:tc>
         <w:tc>
           <w:tcPr>
-            <w:tcW w:type="dxa" w:w="1872"/>
+            <w:tcW w:type="dxa" w:w="1930"/>
             <w:shd w:fill="FFFFFF"/>
           </w:tcPr>
           <w:p>
@@ -7253,7 +7258,7 @@
         </w:tc>
         <w:tc>
           <w:tcPr>
-            <w:tcW w:type="dxa" w:w="1872"/>
+            <w:tcW w:type="dxa" w:w="1930"/>
             <w:shd w:fill="FFFFFF"/>
           </w:tcPr>
           <w:p>
@@ -7269,7 +7274,7 @@
         </w:tc>
         <w:tc>
           <w:tcPr>
-            <w:tcW w:type="dxa" w:w="1872"/>
+            <w:tcW w:type="dxa" w:w="1930"/>
             <w:shd w:fill="FFFFFF"/>
           </w:tcPr>
           <w:p>
@@ -7285,7 +7290,7 @@
         </w:tc>
         <w:tc>
           <w:tcPr>
-            <w:tcW w:type="dxa" w:w="1872"/>
+            <w:tcW w:type="dxa" w:w="1930"/>
             <w:shd w:fill="FFFFFF"/>
           </w:tcPr>
           <w:p>
@@ -7303,7 +7308,7 @@
       <w:tr>
         <w:tc>
           <w:tcPr>
-            <w:tcW w:type="dxa" w:w="1872"/>
+            <w:tcW w:type="dxa" w:w="1930"/>
             <w:shd w:fill="F9FAFB"/>
           </w:tcPr>
           <w:p>
@@ -7319,7 +7324,7 @@
         </w:tc>
         <w:tc>
           <w:tcPr>
-            <w:tcW w:type="dxa" w:w="1872"/>
+            <w:tcW w:type="dxa" w:w="1930"/>
             <w:shd w:fill="F9FAFB"/>
           </w:tcPr>
           <w:p>
@@ -7335,7 +7340,7 @@
         </w:tc>
         <w:tc>
           <w:tcPr>
-            <w:tcW w:type="dxa" w:w="1872"/>
+            <w:tcW w:type="dxa" w:w="1930"/>
             <w:shd w:fill="F9FAFB"/>
           </w:tcPr>
           <w:p>
@@ -7351,7 +7356,7 @@
         </w:tc>
         <w:tc>
           <w:tcPr>
-            <w:tcW w:type="dxa" w:w="1872"/>
+            <w:tcW w:type="dxa" w:w="1930"/>
             <w:shd w:fill="F9FAFB"/>
           </w:tcPr>
           <w:p>
@@ -7367,7 +7372,7 @@
         </w:tc>
         <w:tc>
           <w:tcPr>
-            <w:tcW w:type="dxa" w:w="1872"/>
+            <w:tcW w:type="dxa" w:w="1930"/>
             <w:shd w:fill="F9FAFB"/>
           </w:tcPr>
           <w:p>
@@ -7385,7 +7390,7 @@
       <w:tr>
         <w:tc>
           <w:tcPr>
-            <w:tcW w:type="dxa" w:w="1872"/>
+            <w:tcW w:type="dxa" w:w="1930"/>
             <w:shd w:fill="FFFFFF"/>
           </w:tcPr>
           <w:p>
@@ -7401,7 +7406,7 @@
         </w:tc>
         <w:tc>
           <w:tcPr>
-            <w:tcW w:type="dxa" w:w="1872"/>
+            <w:tcW w:type="dxa" w:w="1930"/>
             <w:shd w:fill="FFFFFF"/>
           </w:tcPr>
           <w:p>
@@ -7417,7 +7422,7 @@
         </w:tc>
         <w:tc>
           <w:tcPr>
-            <w:tcW w:type="dxa" w:w="1872"/>
+            <w:tcW w:type="dxa" w:w="1930"/>
             <w:shd w:fill="FFFFFF"/>
           </w:tcPr>
           <w:p>
@@ -7433,7 +7438,7 @@
         </w:tc>
         <w:tc>
           <w:tcPr>
-            <w:tcW w:type="dxa" w:w="1872"/>
+            <w:tcW w:type="dxa" w:w="1930"/>
             <w:shd w:fill="FFFFFF"/>
           </w:tcPr>
           <w:p>
@@ -7449,7 +7454,7 @@
         </w:tc>
         <w:tc>
           <w:tcPr>
-            <w:tcW w:type="dxa" w:w="1872"/>
+            <w:tcW w:type="dxa" w:w="1930"/>
             <w:shd w:fill="FFFFFF"/>
           </w:tcPr>
           <w:p>
@@ -7468,7 +7473,7 @@
     <w:p/>
     <w:sectPr>
       <w:pgSz w:w="12240" w:h="15840"/>
-      <w:pgMar w:top="1440" w:right="1440" w:bottom="1440" w:left="1440" w:header="720" w:footer="720" w:gutter="0"/>
+      <w:pgMar w:top="1296" w:right="1296" w:bottom="1296" w:left="1296" w:header="720" w:footer="720" w:gutter="0"/>
       <w:cols w:space="720"/>
       <w:docGrid w:linePitch="360"/>
     </w:sectPr>

</xml_diff>